<commit_message>
Updated report bout LabWork
</commit_message>
<xml_diff>
--- a/9.docx
+++ b/9.docx
@@ -73,7 +73,6 @@
         <w:rPr>
           <w:rFonts w:ascii="Times New Roman" w:eastAsia="Times New Roman" w:hAnsi="Times New Roman" w:cs="Times New Roman"/>
           <w:sz w:val="28"/>
-          <w:lang w:val="en-US"/>
         </w:rPr>
         <w:t>9</w:t>
       </w:r>
@@ -643,6 +642,7 @@
         <w:rPr>
           <w:rFonts w:ascii="Times New Roman" w:eastAsia="Times New Roman" w:hAnsi="Times New Roman" w:cs="Times New Roman"/>
           <w:bCs/>
+          <w:noProof/>
           <w:sz w:val="28"/>
           <w:lang w:val="en-US"/>
         </w:rPr>
@@ -699,6 +699,7 @@
         <w:rPr>
           <w:rFonts w:ascii="Times New Roman" w:eastAsia="Times New Roman" w:hAnsi="Times New Roman" w:cs="Times New Roman"/>
           <w:bCs/>
+          <w:noProof/>
           <w:sz w:val="28"/>
           <w:lang w:val="en-US"/>
         </w:rPr>
@@ -937,15 +938,7 @@
           <w:bCs/>
           <w:sz w:val="28"/>
         </w:rPr>
-        <w:t xml:space="preserve"> –</w:t>
-      </w:r>
-      <w:r>
-        <w:rPr>
-          <w:rFonts w:ascii="Times New Roman" w:eastAsia="Times New Roman" w:hAnsi="Times New Roman" w:cs="Times New Roman"/>
-          <w:bCs/>
-          <w:sz w:val="28"/>
-        </w:rPr>
-        <w:t xml:space="preserve"> </w:t>
+        <w:t xml:space="preserve"> – </w:t>
       </w:r>
       <w:proofErr w:type="spellStart"/>
       <w:r>
@@ -963,31 +956,7 @@
           <w:bCs/>
           <w:sz w:val="28"/>
         </w:rPr>
-        <w:t xml:space="preserve"> Е</w:t>
-      </w:r>
-      <w:r>
-        <w:rPr>
-          <w:rFonts w:ascii="Times New Roman" w:eastAsia="Times New Roman" w:hAnsi="Times New Roman" w:cs="Times New Roman"/>
-          <w:bCs/>
-          <w:sz w:val="28"/>
-        </w:rPr>
-        <w:t xml:space="preserve">. </w:t>
-      </w:r>
-      <w:r>
-        <w:rPr>
-          <w:rFonts w:ascii="Times New Roman" w:eastAsia="Times New Roman" w:hAnsi="Times New Roman" w:cs="Times New Roman"/>
-          <w:bCs/>
-          <w:sz w:val="28"/>
-        </w:rPr>
-        <w:t>Е</w:t>
-      </w:r>
-      <w:r>
-        <w:rPr>
-          <w:rFonts w:ascii="Times New Roman" w:eastAsia="Times New Roman" w:hAnsi="Times New Roman" w:cs="Times New Roman"/>
-          <w:bCs/>
-          <w:sz w:val="28"/>
-        </w:rPr>
-        <w:t xml:space="preserve">. </w:t>
+        <w:t xml:space="preserve"> Е. Е. </w:t>
       </w:r>
       <w:r>
         <w:rPr>
@@ -1117,6 +1086,7 @@
         <w:rPr>
           <w:rFonts w:ascii="Times New Roman" w:eastAsia="Times New Roman" w:hAnsi="Times New Roman" w:cs="Times New Roman"/>
           <w:bCs/>
+          <w:noProof/>
           <w:sz w:val="28"/>
         </w:rPr>
         <w:drawing>
@@ -1195,15 +1165,33 @@
           <w:bCs/>
           <w:sz w:val="28"/>
         </w:rPr>
-        <w:t>Этап 1 (подготовительный)</w:t>
-      </w:r>
-      <w:r>
-        <w:rPr>
-          <w:rFonts w:ascii="Times New Roman" w:eastAsia="Times New Roman" w:hAnsi="Times New Roman" w:cs="Times New Roman"/>
-          <w:bCs/>
-          <w:sz w:val="28"/>
-        </w:rPr>
-        <w:t>(Студент №1)</w:t>
+        <w:t>Этап 1 (подготовительный</w:t>
+      </w:r>
+      <w:proofErr w:type="gramStart"/>
+      <w:r>
+        <w:rPr>
+          <w:rFonts w:ascii="Times New Roman" w:eastAsia="Times New Roman" w:hAnsi="Times New Roman" w:cs="Times New Roman"/>
+          <w:bCs/>
+          <w:sz w:val="28"/>
+        </w:rPr>
+        <w:t>)</w:t>
+      </w:r>
+      <w:r>
+        <w:rPr>
+          <w:rFonts w:ascii="Times New Roman" w:eastAsia="Times New Roman" w:hAnsi="Times New Roman" w:cs="Times New Roman"/>
+          <w:bCs/>
+          <w:sz w:val="28"/>
+        </w:rPr>
+        <w:t>(</w:t>
+      </w:r>
+      <w:proofErr w:type="gramEnd"/>
+      <w:r>
+        <w:rPr>
+          <w:rFonts w:ascii="Times New Roman" w:eastAsia="Times New Roman" w:hAnsi="Times New Roman" w:cs="Times New Roman"/>
+          <w:bCs/>
+          <w:sz w:val="28"/>
+        </w:rPr>
+        <w:t>Студент №1)</w:t>
       </w:r>
       <w:r>
         <w:rPr>
@@ -1249,6 +1237,7 @@
         <w:rPr>
           <w:rFonts w:ascii="Times New Roman" w:eastAsia="Times New Roman" w:hAnsi="Times New Roman" w:cs="Times New Roman"/>
           <w:bCs/>
+          <w:noProof/>
           <w:sz w:val="28"/>
         </w:rPr>
         <w:drawing>
@@ -1295,7 +1284,6 @@
           <w:rFonts w:ascii="Times New Roman" w:eastAsia="Times New Roman" w:hAnsi="Times New Roman" w:cs="Times New Roman"/>
           <w:bCs/>
           <w:sz w:val="28"/>
-          <w:lang w:val="en-US"/>
         </w:rPr>
       </w:pPr>
       <w:r>
@@ -1372,6 +1360,7 @@
         <w:rPr>
           <w:rFonts w:ascii="Times New Roman" w:eastAsia="Times New Roman" w:hAnsi="Times New Roman" w:cs="Times New Roman"/>
           <w:bCs/>
+          <w:noProof/>
           <w:sz w:val="28"/>
         </w:rPr>
         <w:drawing>
@@ -1444,6 +1433,7 @@
         <w:rPr>
           <w:rFonts w:ascii="Times New Roman" w:eastAsia="Times New Roman" w:hAnsi="Times New Roman" w:cs="Times New Roman"/>
           <w:bCs/>
+          <w:noProof/>
           <w:sz w:val="28"/>
           <w:lang w:val="en-US"/>
         </w:rPr>
@@ -1549,6 +1539,2118 @@
           <w:sz w:val="28"/>
         </w:rPr>
         <w:t>содержащий отчет по данной лабораторной работе</w:t>
+      </w:r>
+      <w:r>
+        <w:rPr>
+          <w:rFonts w:ascii="Times New Roman" w:eastAsia="Times New Roman" w:hAnsi="Times New Roman" w:cs="Times New Roman"/>
+          <w:bCs/>
+          <w:sz w:val="28"/>
+        </w:rPr>
+        <w:t xml:space="preserve"> </w:t>
+      </w:r>
+      <w:r>
+        <w:rPr>
+          <w:rFonts w:ascii="Times New Roman" w:eastAsia="Times New Roman" w:hAnsi="Times New Roman" w:cs="Times New Roman"/>
+          <w:bCs/>
+          <w:sz w:val="28"/>
+        </w:rPr>
+        <w:t>и зафиксировал изменения</w:t>
+      </w:r>
+    </w:p>
+    <w:p>
+      <w:pPr>
+        <w:spacing w:after="150" w:line="265" w:lineRule="auto"/>
+        <w:jc w:val="center"/>
+        <w:rPr>
+          <w:rFonts w:ascii="Times New Roman" w:eastAsia="Times New Roman" w:hAnsi="Times New Roman" w:cs="Times New Roman"/>
+          <w:bCs/>
+          <w:sz w:val="28"/>
+        </w:rPr>
+      </w:pPr>
+      <w:r>
+        <w:rPr>
+          <w:rFonts w:ascii="Times New Roman" w:eastAsia="Times New Roman" w:hAnsi="Times New Roman" w:cs="Times New Roman"/>
+          <w:bCs/>
+          <w:sz w:val="28"/>
+        </w:rPr>
+        <w:drawing>
+          <wp:inline distT="0" distB="0" distL="0" distR="0" wp14:anchorId="3D93BAE7" wp14:editId="2872AF5F">
+            <wp:extent cx="3896140" cy="1036741"/>
+            <wp:effectExtent l="0" t="0" r="0" b="0"/>
+            <wp:docPr id="2" name="Рисунок 2"/>
+            <wp:cNvGraphicFramePr>
+              <a:graphicFrameLocks xmlns:a="http://schemas.openxmlformats.org/drawingml/2006/main" noChangeAspect="1"/>
+            </wp:cNvGraphicFramePr>
+            <a:graphic xmlns:a="http://schemas.openxmlformats.org/drawingml/2006/main">
+              <a:graphicData uri="http://schemas.openxmlformats.org/drawingml/2006/picture">
+                <pic:pic xmlns:pic="http://schemas.openxmlformats.org/drawingml/2006/picture">
+                  <pic:nvPicPr>
+                    <pic:cNvPr id="1" name=""/>
+                    <pic:cNvPicPr/>
+                  </pic:nvPicPr>
+                  <pic:blipFill>
+                    <a:blip r:embed="rId11"/>
+                    <a:stretch>
+                      <a:fillRect/>
+                    </a:stretch>
+                  </pic:blipFill>
+                  <pic:spPr>
+                    <a:xfrm>
+                      <a:off x="0" y="0"/>
+                      <a:ext cx="3903490" cy="1038697"/>
+                    </a:xfrm>
+                    <a:prstGeom prst="rect">
+                      <a:avLst/>
+                    </a:prstGeom>
+                  </pic:spPr>
+                </pic:pic>
+              </a:graphicData>
+            </a:graphic>
+          </wp:inline>
+        </w:drawing>
+      </w:r>
+    </w:p>
+    <w:p>
+      <w:pPr>
+        <w:spacing w:after="150" w:line="265" w:lineRule="auto"/>
+        <w:rPr>
+          <w:rFonts w:ascii="Times New Roman" w:eastAsia="Times New Roman" w:hAnsi="Times New Roman" w:cs="Times New Roman"/>
+          <w:bCs/>
+          <w:sz w:val="28"/>
+        </w:rPr>
+      </w:pPr>
+      <w:r>
+        <w:rPr>
+          <w:rFonts w:ascii="Times New Roman" w:eastAsia="Times New Roman" w:hAnsi="Times New Roman" w:cs="Times New Roman"/>
+          <w:bCs/>
+          <w:sz w:val="28"/>
+        </w:rPr>
+        <w:lastRenderedPageBreak/>
+        <w:t>-</w:t>
+      </w:r>
+      <w:r>
+        <w:t xml:space="preserve"> </w:t>
+      </w:r>
+      <w:r>
+        <w:rPr>
+          <w:rFonts w:ascii="Times New Roman" w:eastAsia="Times New Roman" w:hAnsi="Times New Roman" w:cs="Times New Roman"/>
+          <w:bCs/>
+          <w:sz w:val="28"/>
+        </w:rPr>
+        <w:t>Д</w:t>
+      </w:r>
+      <w:r>
+        <w:rPr>
+          <w:rFonts w:ascii="Times New Roman" w:eastAsia="Times New Roman" w:hAnsi="Times New Roman" w:cs="Times New Roman"/>
+          <w:bCs/>
+          <w:sz w:val="28"/>
+        </w:rPr>
+        <w:t>оба</w:t>
+      </w:r>
+      <w:r>
+        <w:rPr>
+          <w:rFonts w:ascii="Times New Roman" w:eastAsia="Times New Roman" w:hAnsi="Times New Roman" w:cs="Times New Roman"/>
+          <w:bCs/>
+          <w:sz w:val="28"/>
+        </w:rPr>
+        <w:t>вил</w:t>
+      </w:r>
+      <w:r>
+        <w:rPr>
+          <w:rFonts w:ascii="Times New Roman" w:eastAsia="Times New Roman" w:hAnsi="Times New Roman" w:cs="Times New Roman"/>
+          <w:bCs/>
+          <w:sz w:val="28"/>
+        </w:rPr>
+        <w:t xml:space="preserve"> в локальный репозиторий файлы проекта по дисциплине</w:t>
+      </w:r>
+    </w:p>
+    <w:p>
+      <w:pPr>
+        <w:spacing w:after="150" w:line="265" w:lineRule="auto"/>
+        <w:rPr>
+          <w:rFonts w:ascii="Times New Roman" w:eastAsia="Times New Roman" w:hAnsi="Times New Roman" w:cs="Times New Roman"/>
+          <w:bCs/>
+          <w:sz w:val="28"/>
+        </w:rPr>
+      </w:pPr>
+      <w:r>
+        <w:rPr>
+          <w:rFonts w:ascii="Times New Roman" w:eastAsia="Times New Roman" w:hAnsi="Times New Roman" w:cs="Times New Roman"/>
+          <w:bCs/>
+          <w:sz w:val="28"/>
+        </w:rPr>
+        <w:t>«Программирование» за первый семестр</w:t>
+      </w:r>
+    </w:p>
+    <w:p>
+      <w:pPr>
+        <w:spacing w:after="150" w:line="265" w:lineRule="auto"/>
+        <w:jc w:val="center"/>
+        <w:rPr>
+          <w:rFonts w:ascii="Times New Roman" w:eastAsia="Times New Roman" w:hAnsi="Times New Roman" w:cs="Times New Roman"/>
+          <w:bCs/>
+          <w:sz w:val="28"/>
+        </w:rPr>
+      </w:pPr>
+      <w:r>
+        <w:rPr>
+          <w:rFonts w:ascii="Times New Roman" w:eastAsia="Times New Roman" w:hAnsi="Times New Roman" w:cs="Times New Roman"/>
+          <w:bCs/>
+          <w:sz w:val="28"/>
+        </w:rPr>
+        <w:drawing>
+          <wp:inline distT="0" distB="0" distL="0" distR="0" wp14:anchorId="2C715218" wp14:editId="12672987">
+            <wp:extent cx="5696745" cy="200053"/>
+            <wp:effectExtent l="0" t="0" r="0" b="9525"/>
+            <wp:docPr id="3" name="Рисунок 3"/>
+            <wp:cNvGraphicFramePr>
+              <a:graphicFrameLocks xmlns:a="http://schemas.openxmlformats.org/drawingml/2006/main" noChangeAspect="1"/>
+            </wp:cNvGraphicFramePr>
+            <a:graphic xmlns:a="http://schemas.openxmlformats.org/drawingml/2006/main">
+              <a:graphicData uri="http://schemas.openxmlformats.org/drawingml/2006/picture">
+                <pic:pic xmlns:pic="http://schemas.openxmlformats.org/drawingml/2006/picture">
+                  <pic:nvPicPr>
+                    <pic:cNvPr id="1" name=""/>
+                    <pic:cNvPicPr/>
+                  </pic:nvPicPr>
+                  <pic:blipFill>
+                    <a:blip r:embed="rId12"/>
+                    <a:stretch>
+                      <a:fillRect/>
+                    </a:stretch>
+                  </pic:blipFill>
+                  <pic:spPr>
+                    <a:xfrm>
+                      <a:off x="0" y="0"/>
+                      <a:ext cx="5696745" cy="200053"/>
+                    </a:xfrm>
+                    <a:prstGeom prst="rect">
+                      <a:avLst/>
+                    </a:prstGeom>
+                  </pic:spPr>
+                </pic:pic>
+              </a:graphicData>
+            </a:graphic>
+          </wp:inline>
+        </w:drawing>
+      </w:r>
+    </w:p>
+    <w:p>
+      <w:pPr>
+        <w:spacing w:after="150" w:line="265" w:lineRule="auto"/>
+        <w:rPr>
+          <w:rFonts w:ascii="Times New Roman" w:eastAsia="Times New Roman" w:hAnsi="Times New Roman" w:cs="Times New Roman"/>
+          <w:bCs/>
+          <w:sz w:val="28"/>
+        </w:rPr>
+      </w:pPr>
+      <w:r>
+        <w:rPr>
+          <w:rFonts w:ascii="Times New Roman" w:eastAsia="Times New Roman" w:hAnsi="Times New Roman" w:cs="Times New Roman"/>
+          <w:bCs/>
+          <w:sz w:val="28"/>
+        </w:rPr>
+        <w:t>Зафиксировал эти изменения</w:t>
+      </w:r>
+    </w:p>
+    <w:p>
+      <w:pPr>
+        <w:spacing w:after="150" w:line="265" w:lineRule="auto"/>
+        <w:jc w:val="center"/>
+        <w:rPr>
+          <w:rFonts w:ascii="Times New Roman" w:eastAsia="Times New Roman" w:hAnsi="Times New Roman" w:cs="Times New Roman"/>
+          <w:bCs/>
+          <w:sz w:val="28"/>
+        </w:rPr>
+      </w:pPr>
+      <w:r>
+        <w:rPr>
+          <w:rFonts w:ascii="Times New Roman" w:eastAsia="Times New Roman" w:hAnsi="Times New Roman" w:cs="Times New Roman"/>
+          <w:bCs/>
+          <w:sz w:val="28"/>
+        </w:rPr>
+        <w:drawing>
+          <wp:inline distT="0" distB="0" distL="0" distR="0" wp14:anchorId="58B60332" wp14:editId="59A58C00">
+            <wp:extent cx="4515480" cy="1143160"/>
+            <wp:effectExtent l="0" t="0" r="0" b="0"/>
+            <wp:docPr id="4" name="Рисунок 4"/>
+            <wp:cNvGraphicFramePr>
+              <a:graphicFrameLocks xmlns:a="http://schemas.openxmlformats.org/drawingml/2006/main" noChangeAspect="1"/>
+            </wp:cNvGraphicFramePr>
+            <a:graphic xmlns:a="http://schemas.openxmlformats.org/drawingml/2006/main">
+              <a:graphicData uri="http://schemas.openxmlformats.org/drawingml/2006/picture">
+                <pic:pic xmlns:pic="http://schemas.openxmlformats.org/drawingml/2006/picture">
+                  <pic:nvPicPr>
+                    <pic:cNvPr id="1" name=""/>
+                    <pic:cNvPicPr/>
+                  </pic:nvPicPr>
+                  <pic:blipFill>
+                    <a:blip r:embed="rId13"/>
+                    <a:stretch>
+                      <a:fillRect/>
+                    </a:stretch>
+                  </pic:blipFill>
+                  <pic:spPr>
+                    <a:xfrm>
+                      <a:off x="0" y="0"/>
+                      <a:ext cx="4515480" cy="1143160"/>
+                    </a:xfrm>
+                    <a:prstGeom prst="rect">
+                      <a:avLst/>
+                    </a:prstGeom>
+                  </pic:spPr>
+                </pic:pic>
+              </a:graphicData>
+            </a:graphic>
+          </wp:inline>
+        </w:drawing>
+      </w:r>
+    </w:p>
+    <w:p>
+      <w:pPr>
+        <w:spacing w:after="150" w:line="265" w:lineRule="auto"/>
+        <w:rPr>
+          <w:rFonts w:ascii="Times New Roman" w:eastAsia="Times New Roman" w:hAnsi="Times New Roman" w:cs="Times New Roman"/>
+          <w:bCs/>
+          <w:sz w:val="28"/>
+        </w:rPr>
+      </w:pPr>
+      <w:r>
+        <w:rPr>
+          <w:rFonts w:ascii="Times New Roman" w:eastAsia="Times New Roman" w:hAnsi="Times New Roman" w:cs="Times New Roman"/>
+          <w:bCs/>
+          <w:sz w:val="28"/>
+        </w:rPr>
+        <w:t>Отправил изменения в удаленный репозиторий на главную ветку</w:t>
+      </w:r>
+    </w:p>
+    <w:p>
+      <w:pPr>
+        <w:spacing w:after="150" w:line="265" w:lineRule="auto"/>
+        <w:jc w:val="center"/>
+        <w:rPr>
+          <w:rFonts w:ascii="Times New Roman" w:eastAsia="Times New Roman" w:hAnsi="Times New Roman" w:cs="Times New Roman"/>
+          <w:bCs/>
+          <w:sz w:val="28"/>
+          <w:lang w:val="en-US"/>
+        </w:rPr>
+      </w:pPr>
+      <w:r>
+        <w:rPr>
+          <w:rFonts w:ascii="Times New Roman" w:eastAsia="Times New Roman" w:hAnsi="Times New Roman" w:cs="Times New Roman"/>
+          <w:bCs/>
+          <w:sz w:val="28"/>
+          <w:lang w:val="en-US"/>
+        </w:rPr>
+        <w:drawing>
+          <wp:inline distT="0" distB="0" distL="0" distR="0" wp14:anchorId="7F8FABCC" wp14:editId="45BEB43C">
+            <wp:extent cx="4410691" cy="1400370"/>
+            <wp:effectExtent l="0" t="0" r="9525" b="0"/>
+            <wp:docPr id="5" name="Рисунок 5"/>
+            <wp:cNvGraphicFramePr>
+              <a:graphicFrameLocks xmlns:a="http://schemas.openxmlformats.org/drawingml/2006/main" noChangeAspect="1"/>
+            </wp:cNvGraphicFramePr>
+            <a:graphic xmlns:a="http://schemas.openxmlformats.org/drawingml/2006/main">
+              <a:graphicData uri="http://schemas.openxmlformats.org/drawingml/2006/picture">
+                <pic:pic xmlns:pic="http://schemas.openxmlformats.org/drawingml/2006/picture">
+                  <pic:nvPicPr>
+                    <pic:cNvPr id="1" name=""/>
+                    <pic:cNvPicPr/>
+                  </pic:nvPicPr>
+                  <pic:blipFill>
+                    <a:blip r:embed="rId14"/>
+                    <a:stretch>
+                      <a:fillRect/>
+                    </a:stretch>
+                  </pic:blipFill>
+                  <pic:spPr>
+                    <a:xfrm>
+                      <a:off x="0" y="0"/>
+                      <a:ext cx="4410691" cy="1400370"/>
+                    </a:xfrm>
+                    <a:prstGeom prst="rect">
+                      <a:avLst/>
+                    </a:prstGeom>
+                  </pic:spPr>
+                </pic:pic>
+              </a:graphicData>
+            </a:graphic>
+          </wp:inline>
+        </w:drawing>
+      </w:r>
+    </w:p>
+    <w:p>
+      <w:pPr>
+        <w:spacing w:after="150" w:line="265" w:lineRule="auto"/>
+        <w:rPr>
+          <w:rFonts w:ascii="Times New Roman" w:eastAsia="Times New Roman" w:hAnsi="Times New Roman" w:cs="Times New Roman"/>
+          <w:bCs/>
+          <w:sz w:val="28"/>
+          <w:lang w:val="en-US"/>
+        </w:rPr>
+      </w:pPr>
+      <w:r>
+        <w:rPr>
+          <w:rFonts w:ascii="Times New Roman" w:eastAsia="Times New Roman" w:hAnsi="Times New Roman" w:cs="Times New Roman"/>
+          <w:bCs/>
+          <w:sz w:val="28"/>
+          <w:lang w:val="en-US"/>
+        </w:rPr>
+        <w:drawing>
+          <wp:inline distT="0" distB="0" distL="0" distR="0" wp14:anchorId="315A0B2D" wp14:editId="0C861DA0">
+            <wp:extent cx="5841365" cy="1309370"/>
+            <wp:effectExtent l="0" t="0" r="6985" b="5080"/>
+            <wp:docPr id="6" name="Рисунок 6"/>
+            <wp:cNvGraphicFramePr>
+              <a:graphicFrameLocks xmlns:a="http://schemas.openxmlformats.org/drawingml/2006/main" noChangeAspect="1"/>
+            </wp:cNvGraphicFramePr>
+            <a:graphic xmlns:a="http://schemas.openxmlformats.org/drawingml/2006/main">
+              <a:graphicData uri="http://schemas.openxmlformats.org/drawingml/2006/picture">
+                <pic:pic xmlns:pic="http://schemas.openxmlformats.org/drawingml/2006/picture">
+                  <pic:nvPicPr>
+                    <pic:cNvPr id="1" name=""/>
+                    <pic:cNvPicPr/>
+                  </pic:nvPicPr>
+                  <pic:blipFill>
+                    <a:blip r:embed="rId15"/>
+                    <a:stretch>
+                      <a:fillRect/>
+                    </a:stretch>
+                  </pic:blipFill>
+                  <pic:spPr>
+                    <a:xfrm>
+                      <a:off x="0" y="0"/>
+                      <a:ext cx="5841365" cy="1309370"/>
+                    </a:xfrm>
+                    <a:prstGeom prst="rect">
+                      <a:avLst/>
+                    </a:prstGeom>
+                  </pic:spPr>
+                </pic:pic>
+              </a:graphicData>
+            </a:graphic>
+          </wp:inline>
+        </w:drawing>
+      </w:r>
+    </w:p>
+    <w:p>
+      <w:pPr>
+        <w:spacing w:after="150" w:line="265" w:lineRule="auto"/>
+        <w:rPr>
+          <w:rFonts w:ascii="Times New Roman" w:eastAsia="Times New Roman" w:hAnsi="Times New Roman" w:cs="Times New Roman"/>
+          <w:bCs/>
+          <w:sz w:val="28"/>
+          <w:lang w:val="en-US"/>
+        </w:rPr>
+      </w:pPr>
+      <w:proofErr w:type="spellStart"/>
+      <w:r>
+        <w:rPr>
+          <w:rFonts w:ascii="Times New Roman" w:eastAsia="Times New Roman" w:hAnsi="Times New Roman" w:cs="Times New Roman"/>
+          <w:bCs/>
+          <w:sz w:val="28"/>
+          <w:lang w:val="en-US"/>
+        </w:rPr>
+        <w:t>Этап</w:t>
+      </w:r>
+      <w:proofErr w:type="spellEnd"/>
+      <w:r>
+        <w:rPr>
+          <w:rFonts w:ascii="Times New Roman" w:eastAsia="Times New Roman" w:hAnsi="Times New Roman" w:cs="Times New Roman"/>
+          <w:bCs/>
+          <w:sz w:val="28"/>
+          <w:lang w:val="en-US"/>
+        </w:rPr>
+        <w:t xml:space="preserve"> 2 (</w:t>
+      </w:r>
+      <w:proofErr w:type="spellStart"/>
+      <w:r>
+        <w:rPr>
+          <w:rFonts w:ascii="Times New Roman" w:eastAsia="Times New Roman" w:hAnsi="Times New Roman" w:cs="Times New Roman"/>
+          <w:bCs/>
+          <w:sz w:val="28"/>
+          <w:lang w:val="en-US"/>
+        </w:rPr>
+        <w:t>основной</w:t>
+      </w:r>
+      <w:proofErr w:type="spellEnd"/>
+      <w:r>
+        <w:rPr>
+          <w:rFonts w:ascii="Times New Roman" w:eastAsia="Times New Roman" w:hAnsi="Times New Roman" w:cs="Times New Roman"/>
+          <w:bCs/>
+          <w:sz w:val="28"/>
+          <w:lang w:val="en-US"/>
+        </w:rPr>
+        <w:t>).</w:t>
+      </w:r>
+    </w:p>
+    <w:p>
+      <w:pPr>
+        <w:spacing w:after="150" w:line="265" w:lineRule="auto"/>
+        <w:rPr>
+          <w:rFonts w:ascii="Times New Roman" w:eastAsia="Times New Roman" w:hAnsi="Times New Roman" w:cs="Times New Roman"/>
+          <w:bCs/>
+          <w:sz w:val="28"/>
+        </w:rPr>
+      </w:pPr>
+      <w:r>
+        <w:rPr>
+          <w:rFonts w:ascii="Times New Roman" w:eastAsia="Times New Roman" w:hAnsi="Times New Roman" w:cs="Times New Roman"/>
+          <w:bCs/>
+          <w:sz w:val="28"/>
+        </w:rPr>
+        <w:t>Студент №1:</w:t>
+      </w:r>
+    </w:p>
+    <w:p>
+      <w:pPr>
+        <w:spacing w:after="150" w:line="265" w:lineRule="auto"/>
+        <w:rPr>
+          <w:rFonts w:ascii="Times New Roman" w:eastAsia="Times New Roman" w:hAnsi="Times New Roman" w:cs="Times New Roman"/>
+          <w:bCs/>
+          <w:sz w:val="28"/>
+        </w:rPr>
+      </w:pPr>
+      <w:r>
+        <w:rPr>
+          <w:rFonts w:ascii="Times New Roman" w:eastAsia="Times New Roman" w:hAnsi="Times New Roman" w:cs="Times New Roman"/>
+          <w:bCs/>
+          <w:sz w:val="28"/>
+        </w:rPr>
+        <w:t xml:space="preserve">Перешел в новую ветку со своей фамилией </w:t>
+      </w:r>
+    </w:p>
+    <w:p>
+      <w:pPr>
+        <w:spacing w:after="150" w:line="265" w:lineRule="auto"/>
+        <w:jc w:val="center"/>
+        <w:rPr>
+          <w:rFonts w:ascii="Times New Roman" w:eastAsia="Times New Roman" w:hAnsi="Times New Roman" w:cs="Times New Roman"/>
+          <w:bCs/>
+          <w:sz w:val="28"/>
+        </w:rPr>
+      </w:pPr>
+      <w:r>
+        <w:rPr>
+          <w:rFonts w:ascii="Times New Roman" w:eastAsia="Times New Roman" w:hAnsi="Times New Roman" w:cs="Times New Roman"/>
+          <w:bCs/>
+          <w:sz w:val="28"/>
+        </w:rPr>
+        <w:drawing>
+          <wp:inline distT="0" distB="0" distL="0" distR="0" wp14:anchorId="3055480A" wp14:editId="52B978A1">
+            <wp:extent cx="4372585" cy="409632"/>
+            <wp:effectExtent l="0" t="0" r="9525" b="9525"/>
+            <wp:docPr id="7" name="Рисунок 7"/>
+            <wp:cNvGraphicFramePr>
+              <a:graphicFrameLocks xmlns:a="http://schemas.openxmlformats.org/drawingml/2006/main" noChangeAspect="1"/>
+            </wp:cNvGraphicFramePr>
+            <a:graphic xmlns:a="http://schemas.openxmlformats.org/drawingml/2006/main">
+              <a:graphicData uri="http://schemas.openxmlformats.org/drawingml/2006/picture">
+                <pic:pic xmlns:pic="http://schemas.openxmlformats.org/drawingml/2006/picture">
+                  <pic:nvPicPr>
+                    <pic:cNvPr id="1" name=""/>
+                    <pic:cNvPicPr/>
+                  </pic:nvPicPr>
+                  <pic:blipFill>
+                    <a:blip r:embed="rId16"/>
+                    <a:stretch>
+                      <a:fillRect/>
+                    </a:stretch>
+                  </pic:blipFill>
+                  <pic:spPr>
+                    <a:xfrm>
+                      <a:off x="0" y="0"/>
+                      <a:ext cx="4372585" cy="409632"/>
+                    </a:xfrm>
+                    <a:prstGeom prst="rect">
+                      <a:avLst/>
+                    </a:prstGeom>
+                  </pic:spPr>
+                </pic:pic>
+              </a:graphicData>
+            </a:graphic>
+          </wp:inline>
+        </w:drawing>
+      </w:r>
+    </w:p>
+    <w:p>
+      <w:pPr>
+        <w:spacing w:after="150" w:line="265" w:lineRule="auto"/>
+        <w:rPr>
+          <w:rFonts w:ascii="Times New Roman" w:eastAsia="Times New Roman" w:hAnsi="Times New Roman" w:cs="Times New Roman"/>
+          <w:bCs/>
+          <w:sz w:val="28"/>
+        </w:rPr>
+      </w:pPr>
+      <w:r>
+        <w:rPr>
+          <w:rFonts w:ascii="Times New Roman" w:eastAsia="Times New Roman" w:hAnsi="Times New Roman" w:cs="Times New Roman"/>
+          <w:bCs/>
+          <w:sz w:val="28"/>
+        </w:rPr>
+        <w:t>Изменил данные в отчете по лабораторной работе по программированию</w:t>
+      </w:r>
+      <w:r>
+        <w:rPr>
+          <w:rFonts w:ascii="Times New Roman" w:eastAsia="Times New Roman" w:hAnsi="Times New Roman" w:cs="Times New Roman"/>
+          <w:bCs/>
+          <w:sz w:val="28"/>
+        </w:rPr>
+        <w:t xml:space="preserve"> </w:t>
+      </w:r>
+      <w:r>
+        <w:rPr>
+          <w:rFonts w:ascii="Times New Roman" w:eastAsia="Times New Roman" w:hAnsi="Times New Roman" w:cs="Times New Roman"/>
+          <w:bCs/>
+          <w:sz w:val="28"/>
+        </w:rPr>
+        <w:t>и сохранил изменения</w:t>
+      </w:r>
+    </w:p>
+    <w:p>
+      <w:pPr>
+        <w:spacing w:after="150" w:line="265" w:lineRule="auto"/>
+        <w:jc w:val="center"/>
+        <w:rPr>
+          <w:rFonts w:ascii="Times New Roman" w:eastAsia="Times New Roman" w:hAnsi="Times New Roman" w:cs="Times New Roman"/>
+          <w:bCs/>
+          <w:sz w:val="28"/>
+        </w:rPr>
+      </w:pPr>
+      <w:r>
+        <w:rPr>
+          <w:rFonts w:ascii="Times New Roman" w:eastAsia="Times New Roman" w:hAnsi="Times New Roman" w:cs="Times New Roman"/>
+          <w:bCs/>
+          <w:sz w:val="28"/>
+        </w:rPr>
+        <w:drawing>
+          <wp:inline distT="0" distB="0" distL="0" distR="0" wp14:anchorId="2171EA0E" wp14:editId="2A2CCCB1">
+            <wp:extent cx="4591691" cy="1047896"/>
+            <wp:effectExtent l="0" t="0" r="0" b="0"/>
+            <wp:docPr id="8" name="Рисунок 8"/>
+            <wp:cNvGraphicFramePr>
+              <a:graphicFrameLocks xmlns:a="http://schemas.openxmlformats.org/drawingml/2006/main" noChangeAspect="1"/>
+            </wp:cNvGraphicFramePr>
+            <a:graphic xmlns:a="http://schemas.openxmlformats.org/drawingml/2006/main">
+              <a:graphicData uri="http://schemas.openxmlformats.org/drawingml/2006/picture">
+                <pic:pic xmlns:pic="http://schemas.openxmlformats.org/drawingml/2006/picture">
+                  <pic:nvPicPr>
+                    <pic:cNvPr id="1" name=""/>
+                    <pic:cNvPicPr/>
+                  </pic:nvPicPr>
+                  <pic:blipFill>
+                    <a:blip r:embed="rId17"/>
+                    <a:stretch>
+                      <a:fillRect/>
+                    </a:stretch>
+                  </pic:blipFill>
+                  <pic:spPr>
+                    <a:xfrm>
+                      <a:off x="0" y="0"/>
+                      <a:ext cx="4591691" cy="1047896"/>
+                    </a:xfrm>
+                    <a:prstGeom prst="rect">
+                      <a:avLst/>
+                    </a:prstGeom>
+                  </pic:spPr>
+                </pic:pic>
+              </a:graphicData>
+            </a:graphic>
+          </wp:inline>
+        </w:drawing>
+      </w:r>
+    </w:p>
+    <w:p>
+      <w:pPr>
+        <w:spacing w:after="150" w:line="265" w:lineRule="auto"/>
+        <w:rPr>
+          <w:rFonts w:ascii="Times New Roman" w:eastAsia="Times New Roman" w:hAnsi="Times New Roman" w:cs="Times New Roman"/>
+          <w:bCs/>
+          <w:sz w:val="28"/>
+        </w:rPr>
+      </w:pPr>
+      <w:r>
+        <w:rPr>
+          <w:rFonts w:ascii="Times New Roman" w:eastAsia="Times New Roman" w:hAnsi="Times New Roman" w:cs="Times New Roman"/>
+          <w:bCs/>
+          <w:sz w:val="28"/>
+        </w:rPr>
+        <w:lastRenderedPageBreak/>
+        <w:t xml:space="preserve">Создал файл </w:t>
+      </w:r>
+      <w:r>
+        <w:rPr>
+          <w:rFonts w:ascii="Times New Roman" w:eastAsia="Times New Roman" w:hAnsi="Times New Roman" w:cs="Times New Roman"/>
+          <w:bCs/>
+          <w:sz w:val="28"/>
+        </w:rPr>
+        <w:t>1.</w:t>
+      </w:r>
+      <w:r>
+        <w:rPr>
+          <w:rFonts w:ascii="Times New Roman" w:eastAsia="Times New Roman" w:hAnsi="Times New Roman" w:cs="Times New Roman"/>
+          <w:bCs/>
+          <w:sz w:val="28"/>
+          <w:lang w:val="en-US"/>
+        </w:rPr>
+        <w:t>docx</w:t>
+      </w:r>
+      <w:r>
+        <w:rPr>
+          <w:rFonts w:ascii="Times New Roman" w:eastAsia="Times New Roman" w:hAnsi="Times New Roman" w:cs="Times New Roman"/>
+          <w:bCs/>
+          <w:sz w:val="28"/>
+        </w:rPr>
+        <w:t xml:space="preserve"> </w:t>
+      </w:r>
+      <w:r>
+        <w:rPr>
+          <w:rFonts w:ascii="Times New Roman" w:eastAsia="Times New Roman" w:hAnsi="Times New Roman" w:cs="Times New Roman"/>
+          <w:bCs/>
+          <w:sz w:val="28"/>
+        </w:rPr>
+        <w:t xml:space="preserve">в котором описал свои действия и вставил скриншот из консоли </w:t>
+      </w:r>
+      <w:r>
+        <w:rPr>
+          <w:rFonts w:ascii="Times New Roman" w:eastAsia="Times New Roman" w:hAnsi="Times New Roman" w:cs="Times New Roman"/>
+          <w:bCs/>
+          <w:sz w:val="28"/>
+          <w:lang w:val="en-US"/>
+        </w:rPr>
+        <w:t>git</w:t>
+      </w:r>
+      <w:r>
+        <w:rPr>
+          <w:rFonts w:ascii="Times New Roman" w:eastAsia="Times New Roman" w:hAnsi="Times New Roman" w:cs="Times New Roman"/>
+          <w:bCs/>
+          <w:sz w:val="28"/>
+        </w:rPr>
+        <w:t xml:space="preserve"> </w:t>
+      </w:r>
+    </w:p>
+    <w:p>
+      <w:pPr>
+        <w:spacing w:after="150" w:line="265" w:lineRule="auto"/>
+        <w:rPr>
+          <w:rFonts w:ascii="Times New Roman" w:eastAsia="Times New Roman" w:hAnsi="Times New Roman" w:cs="Times New Roman"/>
+          <w:bCs/>
+          <w:sz w:val="28"/>
+        </w:rPr>
+      </w:pPr>
+      <w:r>
+        <w:rPr>
+          <w:rFonts w:ascii="Times New Roman" w:eastAsia="Times New Roman" w:hAnsi="Times New Roman" w:cs="Times New Roman"/>
+          <w:bCs/>
+          <w:sz w:val="28"/>
+        </w:rPr>
+        <w:drawing>
+          <wp:inline distT="0" distB="0" distL="0" distR="0" wp14:anchorId="39ACE383" wp14:editId="3006688B">
+            <wp:extent cx="5841365" cy="2350135"/>
+            <wp:effectExtent l="0" t="0" r="6985" b="0"/>
+            <wp:docPr id="9" name="Рисунок 9"/>
+            <wp:cNvGraphicFramePr>
+              <a:graphicFrameLocks xmlns:a="http://schemas.openxmlformats.org/drawingml/2006/main" noChangeAspect="1"/>
+            </wp:cNvGraphicFramePr>
+            <a:graphic xmlns:a="http://schemas.openxmlformats.org/drawingml/2006/main">
+              <a:graphicData uri="http://schemas.openxmlformats.org/drawingml/2006/picture">
+                <pic:pic xmlns:pic="http://schemas.openxmlformats.org/drawingml/2006/picture">
+                  <pic:nvPicPr>
+                    <pic:cNvPr id="1" name=""/>
+                    <pic:cNvPicPr/>
+                  </pic:nvPicPr>
+                  <pic:blipFill>
+                    <a:blip r:embed="rId18"/>
+                    <a:stretch>
+                      <a:fillRect/>
+                    </a:stretch>
+                  </pic:blipFill>
+                  <pic:spPr>
+                    <a:xfrm>
+                      <a:off x="0" y="0"/>
+                      <a:ext cx="5841365" cy="2350135"/>
+                    </a:xfrm>
+                    <a:prstGeom prst="rect">
+                      <a:avLst/>
+                    </a:prstGeom>
+                  </pic:spPr>
+                </pic:pic>
+              </a:graphicData>
+            </a:graphic>
+          </wp:inline>
+        </w:drawing>
+      </w:r>
+    </w:p>
+    <w:p>
+      <w:pPr>
+        <w:spacing w:after="150" w:line="265" w:lineRule="auto"/>
+        <w:rPr>
+          <w:rFonts w:ascii="Times New Roman" w:eastAsia="Times New Roman" w:hAnsi="Times New Roman" w:cs="Times New Roman"/>
+          <w:bCs/>
+          <w:sz w:val="28"/>
+        </w:rPr>
+      </w:pPr>
+      <w:r>
+        <w:rPr>
+          <w:rFonts w:ascii="Times New Roman" w:eastAsia="Times New Roman" w:hAnsi="Times New Roman" w:cs="Times New Roman"/>
+          <w:bCs/>
+          <w:sz w:val="28"/>
+        </w:rPr>
+        <w:t>Зафиксировал добавление файла</w:t>
+      </w:r>
+    </w:p>
+    <w:p>
+      <w:pPr>
+        <w:spacing w:after="150" w:line="265" w:lineRule="auto"/>
+        <w:jc w:val="center"/>
+        <w:rPr>
+          <w:rFonts w:ascii="Times New Roman" w:eastAsia="Times New Roman" w:hAnsi="Times New Roman" w:cs="Times New Roman"/>
+          <w:bCs/>
+          <w:sz w:val="28"/>
+        </w:rPr>
+      </w:pPr>
+      <w:r>
+        <w:rPr>
+          <w:rFonts w:ascii="Times New Roman" w:eastAsia="Times New Roman" w:hAnsi="Times New Roman" w:cs="Times New Roman"/>
+          <w:bCs/>
+          <w:sz w:val="28"/>
+        </w:rPr>
+        <w:drawing>
+          <wp:inline distT="0" distB="0" distL="0" distR="0" wp14:anchorId="3CDFC4C2" wp14:editId="6F8C179F">
+            <wp:extent cx="4410691" cy="1133633"/>
+            <wp:effectExtent l="0" t="0" r="9525" b="9525"/>
+            <wp:docPr id="10" name="Рисунок 10"/>
+            <wp:cNvGraphicFramePr>
+              <a:graphicFrameLocks xmlns:a="http://schemas.openxmlformats.org/drawingml/2006/main" noChangeAspect="1"/>
+            </wp:cNvGraphicFramePr>
+            <a:graphic xmlns:a="http://schemas.openxmlformats.org/drawingml/2006/main">
+              <a:graphicData uri="http://schemas.openxmlformats.org/drawingml/2006/picture">
+                <pic:pic xmlns:pic="http://schemas.openxmlformats.org/drawingml/2006/picture">
+                  <pic:nvPicPr>
+                    <pic:cNvPr id="1" name=""/>
+                    <pic:cNvPicPr/>
+                  </pic:nvPicPr>
+                  <pic:blipFill>
+                    <a:blip r:embed="rId19"/>
+                    <a:stretch>
+                      <a:fillRect/>
+                    </a:stretch>
+                  </pic:blipFill>
+                  <pic:spPr>
+                    <a:xfrm>
+                      <a:off x="0" y="0"/>
+                      <a:ext cx="4410691" cy="1133633"/>
+                    </a:xfrm>
+                    <a:prstGeom prst="rect">
+                      <a:avLst/>
+                    </a:prstGeom>
+                  </pic:spPr>
+                </pic:pic>
+              </a:graphicData>
+            </a:graphic>
+          </wp:inline>
+        </w:drawing>
+      </w:r>
+    </w:p>
+    <w:p>
+      <w:pPr>
+        <w:spacing w:after="150" w:line="265" w:lineRule="auto"/>
+        <w:rPr>
+          <w:rFonts w:ascii="Times New Roman" w:eastAsia="Times New Roman" w:hAnsi="Times New Roman" w:cs="Times New Roman"/>
+          <w:bCs/>
+          <w:sz w:val="28"/>
+        </w:rPr>
+      </w:pPr>
+      <w:r>
+        <w:rPr>
+          <w:rFonts w:ascii="Times New Roman" w:eastAsia="Times New Roman" w:hAnsi="Times New Roman" w:cs="Times New Roman"/>
+          <w:bCs/>
+          <w:sz w:val="28"/>
+        </w:rPr>
+        <w:t>О</w:t>
+      </w:r>
+      <w:r>
+        <w:rPr>
+          <w:rFonts w:ascii="Times New Roman" w:eastAsia="Times New Roman" w:hAnsi="Times New Roman" w:cs="Times New Roman"/>
+          <w:bCs/>
+          <w:sz w:val="28"/>
+        </w:rPr>
+        <w:t>тправ</w:t>
+      </w:r>
+      <w:r>
+        <w:rPr>
+          <w:rFonts w:ascii="Times New Roman" w:eastAsia="Times New Roman" w:hAnsi="Times New Roman" w:cs="Times New Roman"/>
+          <w:bCs/>
+          <w:sz w:val="28"/>
+        </w:rPr>
+        <w:t>ил</w:t>
+      </w:r>
+      <w:r>
+        <w:rPr>
+          <w:rFonts w:ascii="Times New Roman" w:eastAsia="Times New Roman" w:hAnsi="Times New Roman" w:cs="Times New Roman"/>
+          <w:bCs/>
+          <w:sz w:val="28"/>
+        </w:rPr>
+        <w:t xml:space="preserve"> зафиксированные изменения в удаленный репозиторий в</w:t>
+      </w:r>
+    </w:p>
+    <w:p>
+      <w:pPr>
+        <w:spacing w:after="150" w:line="265" w:lineRule="auto"/>
+        <w:rPr>
+          <w:rFonts w:ascii="Times New Roman" w:eastAsia="Times New Roman" w:hAnsi="Times New Roman" w:cs="Times New Roman"/>
+          <w:bCs/>
+          <w:sz w:val="28"/>
+        </w:rPr>
+      </w:pPr>
+      <w:r>
+        <w:rPr>
+          <w:rFonts w:ascii="Times New Roman" w:eastAsia="Times New Roman" w:hAnsi="Times New Roman" w:cs="Times New Roman"/>
+          <w:bCs/>
+          <w:sz w:val="28"/>
+        </w:rPr>
+        <w:t xml:space="preserve">свою </w:t>
+      </w:r>
+      <w:r>
+        <w:rPr>
+          <w:rFonts w:ascii="Times New Roman" w:eastAsia="Times New Roman" w:hAnsi="Times New Roman" w:cs="Times New Roman"/>
+          <w:bCs/>
+          <w:sz w:val="28"/>
+        </w:rPr>
+        <w:t>ветку</w:t>
+      </w:r>
+    </w:p>
+    <w:p>
+      <w:pPr>
+        <w:spacing w:after="150" w:line="265" w:lineRule="auto"/>
+        <w:jc w:val="center"/>
+        <w:rPr>
+          <w:rFonts w:ascii="Times New Roman" w:eastAsia="Times New Roman" w:hAnsi="Times New Roman" w:cs="Times New Roman"/>
+          <w:bCs/>
+          <w:sz w:val="28"/>
+          <w:lang w:val="en-US"/>
+        </w:rPr>
+      </w:pPr>
+      <w:r>
+        <w:rPr>
+          <w:rFonts w:ascii="Times New Roman" w:eastAsia="Times New Roman" w:hAnsi="Times New Roman" w:cs="Times New Roman"/>
+          <w:bCs/>
+          <w:sz w:val="28"/>
+          <w:lang w:val="en-US"/>
+        </w:rPr>
+        <w:drawing>
+          <wp:inline distT="0" distB="0" distL="0" distR="0" wp14:anchorId="7166058E" wp14:editId="71F006BA">
+            <wp:extent cx="4572638" cy="2095792"/>
+            <wp:effectExtent l="0" t="0" r="0" b="0"/>
+            <wp:docPr id="11" name="Рисунок 11"/>
+            <wp:cNvGraphicFramePr>
+              <a:graphicFrameLocks xmlns:a="http://schemas.openxmlformats.org/drawingml/2006/main" noChangeAspect="1"/>
+            </wp:cNvGraphicFramePr>
+            <a:graphic xmlns:a="http://schemas.openxmlformats.org/drawingml/2006/main">
+              <a:graphicData uri="http://schemas.openxmlformats.org/drawingml/2006/picture">
+                <pic:pic xmlns:pic="http://schemas.openxmlformats.org/drawingml/2006/picture">
+                  <pic:nvPicPr>
+                    <pic:cNvPr id="1" name=""/>
+                    <pic:cNvPicPr/>
+                  </pic:nvPicPr>
+                  <pic:blipFill>
+                    <a:blip r:embed="rId20"/>
+                    <a:stretch>
+                      <a:fillRect/>
+                    </a:stretch>
+                  </pic:blipFill>
+                  <pic:spPr>
+                    <a:xfrm>
+                      <a:off x="0" y="0"/>
+                      <a:ext cx="4572638" cy="2095792"/>
+                    </a:xfrm>
+                    <a:prstGeom prst="rect">
+                      <a:avLst/>
+                    </a:prstGeom>
+                  </pic:spPr>
+                </pic:pic>
+              </a:graphicData>
+            </a:graphic>
+          </wp:inline>
+        </w:drawing>
+      </w:r>
+    </w:p>
+    <w:p>
+      <w:pPr>
+        <w:spacing w:after="150" w:line="265" w:lineRule="auto"/>
+        <w:jc w:val="center"/>
+        <w:rPr>
+          <w:rFonts w:ascii="Times New Roman" w:eastAsia="Times New Roman" w:hAnsi="Times New Roman" w:cs="Times New Roman"/>
+          <w:bCs/>
+          <w:sz w:val="28"/>
+          <w:lang w:val="en-US"/>
+        </w:rPr>
+      </w:pPr>
+      <w:r>
+        <w:rPr>
+          <w:rFonts w:ascii="Times New Roman" w:eastAsia="Times New Roman" w:hAnsi="Times New Roman" w:cs="Times New Roman"/>
+          <w:bCs/>
+          <w:sz w:val="28"/>
+          <w:lang w:val="en-US"/>
+        </w:rPr>
+        <w:drawing>
+          <wp:inline distT="0" distB="0" distL="0" distR="0" wp14:anchorId="78CEB53F" wp14:editId="36B7F5AF">
+            <wp:extent cx="5841365" cy="616585"/>
+            <wp:effectExtent l="0" t="0" r="6985" b="0"/>
+            <wp:docPr id="12" name="Рисунок 12"/>
+            <wp:cNvGraphicFramePr>
+              <a:graphicFrameLocks xmlns:a="http://schemas.openxmlformats.org/drawingml/2006/main" noChangeAspect="1"/>
+            </wp:cNvGraphicFramePr>
+            <a:graphic xmlns:a="http://schemas.openxmlformats.org/drawingml/2006/main">
+              <a:graphicData uri="http://schemas.openxmlformats.org/drawingml/2006/picture">
+                <pic:pic xmlns:pic="http://schemas.openxmlformats.org/drawingml/2006/picture">
+                  <pic:nvPicPr>
+                    <pic:cNvPr id="1" name=""/>
+                    <pic:cNvPicPr/>
+                  </pic:nvPicPr>
+                  <pic:blipFill>
+                    <a:blip r:embed="rId21"/>
+                    <a:stretch>
+                      <a:fillRect/>
+                    </a:stretch>
+                  </pic:blipFill>
+                  <pic:spPr>
+                    <a:xfrm>
+                      <a:off x="0" y="0"/>
+                      <a:ext cx="5841365" cy="616585"/>
+                    </a:xfrm>
+                    <a:prstGeom prst="rect">
+                      <a:avLst/>
+                    </a:prstGeom>
+                  </pic:spPr>
+                </pic:pic>
+              </a:graphicData>
+            </a:graphic>
+          </wp:inline>
+        </w:drawing>
+      </w:r>
+    </w:p>
+    <w:p>
+      <w:pPr>
+        <w:spacing w:after="150" w:line="265" w:lineRule="auto"/>
+        <w:rPr>
+          <w:rFonts w:ascii="Times New Roman" w:eastAsia="Times New Roman" w:hAnsi="Times New Roman" w:cs="Times New Roman"/>
+          <w:bCs/>
+          <w:sz w:val="28"/>
+        </w:rPr>
+      </w:pPr>
+      <w:r>
+        <w:rPr>
+          <w:rFonts w:ascii="Times New Roman" w:eastAsia="Times New Roman" w:hAnsi="Times New Roman" w:cs="Times New Roman"/>
+          <w:bCs/>
+          <w:sz w:val="28"/>
+        </w:rPr>
+        <w:t>В</w:t>
+      </w:r>
+      <w:r>
+        <w:rPr>
+          <w:rFonts w:ascii="Times New Roman" w:eastAsia="Times New Roman" w:hAnsi="Times New Roman" w:cs="Times New Roman"/>
+          <w:bCs/>
+          <w:sz w:val="28"/>
+        </w:rPr>
+        <w:t>ыполн</w:t>
+      </w:r>
+      <w:r>
+        <w:rPr>
+          <w:rFonts w:ascii="Times New Roman" w:eastAsia="Times New Roman" w:hAnsi="Times New Roman" w:cs="Times New Roman"/>
+          <w:bCs/>
+          <w:sz w:val="28"/>
+        </w:rPr>
+        <w:t>ил</w:t>
+      </w:r>
+      <w:r>
+        <w:rPr>
+          <w:rFonts w:ascii="Times New Roman" w:eastAsia="Times New Roman" w:hAnsi="Times New Roman" w:cs="Times New Roman"/>
+          <w:bCs/>
+          <w:sz w:val="28"/>
+        </w:rPr>
+        <w:t xml:space="preserve"> слияние с веткой </w:t>
+      </w:r>
+      <w:proofErr w:type="spellStart"/>
+      <w:r>
+        <w:rPr>
+          <w:rFonts w:ascii="Times New Roman" w:eastAsia="Times New Roman" w:hAnsi="Times New Roman" w:cs="Times New Roman"/>
+          <w:bCs/>
+          <w:sz w:val="28"/>
+        </w:rPr>
+        <w:t>master</w:t>
+      </w:r>
+      <w:proofErr w:type="spellEnd"/>
+      <w:r>
+        <w:rPr>
+          <w:rFonts w:ascii="Times New Roman" w:eastAsia="Times New Roman" w:hAnsi="Times New Roman" w:cs="Times New Roman"/>
+          <w:bCs/>
+          <w:sz w:val="28"/>
+        </w:rPr>
+        <w:t>.</w:t>
+      </w:r>
+    </w:p>
+    <w:p>
+      <w:pPr>
+        <w:spacing w:after="150" w:line="265" w:lineRule="auto"/>
+        <w:jc w:val="center"/>
+        <w:rPr>
+          <w:rFonts w:ascii="Times New Roman" w:eastAsia="Times New Roman" w:hAnsi="Times New Roman" w:cs="Times New Roman"/>
+          <w:bCs/>
+          <w:sz w:val="28"/>
+          <w:lang w:val="en-US"/>
+        </w:rPr>
+      </w:pPr>
+      <w:r>
+        <w:rPr>
+          <w:rFonts w:ascii="Times New Roman" w:eastAsia="Times New Roman" w:hAnsi="Times New Roman" w:cs="Times New Roman"/>
+          <w:bCs/>
+          <w:sz w:val="28"/>
+          <w:lang w:val="en-US"/>
+        </w:rPr>
+        <w:lastRenderedPageBreak/>
+        <w:drawing>
+          <wp:inline distT="0" distB="0" distL="0" distR="0" wp14:anchorId="3BB49FBD" wp14:editId="1B60D6C7">
+            <wp:extent cx="4515480" cy="1781424"/>
+            <wp:effectExtent l="0" t="0" r="0" b="9525"/>
+            <wp:docPr id="13" name="Рисунок 13"/>
+            <wp:cNvGraphicFramePr>
+              <a:graphicFrameLocks xmlns:a="http://schemas.openxmlformats.org/drawingml/2006/main" noChangeAspect="1"/>
+            </wp:cNvGraphicFramePr>
+            <a:graphic xmlns:a="http://schemas.openxmlformats.org/drawingml/2006/main">
+              <a:graphicData uri="http://schemas.openxmlformats.org/drawingml/2006/picture">
+                <pic:pic xmlns:pic="http://schemas.openxmlformats.org/drawingml/2006/picture">
+                  <pic:nvPicPr>
+                    <pic:cNvPr id="1" name=""/>
+                    <pic:cNvPicPr/>
+                  </pic:nvPicPr>
+                  <pic:blipFill>
+                    <a:blip r:embed="rId22"/>
+                    <a:stretch>
+                      <a:fillRect/>
+                    </a:stretch>
+                  </pic:blipFill>
+                  <pic:spPr>
+                    <a:xfrm>
+                      <a:off x="0" y="0"/>
+                      <a:ext cx="4515480" cy="1781424"/>
+                    </a:xfrm>
+                    <a:prstGeom prst="rect">
+                      <a:avLst/>
+                    </a:prstGeom>
+                  </pic:spPr>
+                </pic:pic>
+              </a:graphicData>
+            </a:graphic>
+          </wp:inline>
+        </w:drawing>
+      </w:r>
+    </w:p>
+    <w:p>
+      <w:pPr>
+        <w:spacing w:after="150" w:line="265" w:lineRule="auto"/>
+        <w:jc w:val="center"/>
+        <w:rPr>
+          <w:rFonts w:ascii="Times New Roman" w:eastAsia="Times New Roman" w:hAnsi="Times New Roman" w:cs="Times New Roman"/>
+          <w:bCs/>
+          <w:sz w:val="28"/>
+          <w:lang w:val="en-US"/>
+        </w:rPr>
+      </w:pPr>
+      <w:r>
+        <w:rPr>
+          <w:rFonts w:ascii="Times New Roman" w:eastAsia="Times New Roman" w:hAnsi="Times New Roman" w:cs="Times New Roman"/>
+          <w:bCs/>
+          <w:sz w:val="28"/>
+          <w:lang w:val="en-US"/>
+        </w:rPr>
+        <w:drawing>
+          <wp:inline distT="0" distB="0" distL="0" distR="0" wp14:anchorId="7F8BFFB0" wp14:editId="38DCF401">
+            <wp:extent cx="4391638" cy="1390844"/>
+            <wp:effectExtent l="0" t="0" r="9525" b="0"/>
+            <wp:docPr id="14" name="Рисунок 14"/>
+            <wp:cNvGraphicFramePr>
+              <a:graphicFrameLocks xmlns:a="http://schemas.openxmlformats.org/drawingml/2006/main" noChangeAspect="1"/>
+            </wp:cNvGraphicFramePr>
+            <a:graphic xmlns:a="http://schemas.openxmlformats.org/drawingml/2006/main">
+              <a:graphicData uri="http://schemas.openxmlformats.org/drawingml/2006/picture">
+                <pic:pic xmlns:pic="http://schemas.openxmlformats.org/drawingml/2006/picture">
+                  <pic:nvPicPr>
+                    <pic:cNvPr id="1" name=""/>
+                    <pic:cNvPicPr/>
+                  </pic:nvPicPr>
+                  <pic:blipFill>
+                    <a:blip r:embed="rId23"/>
+                    <a:stretch>
+                      <a:fillRect/>
+                    </a:stretch>
+                  </pic:blipFill>
+                  <pic:spPr>
+                    <a:xfrm>
+                      <a:off x="0" y="0"/>
+                      <a:ext cx="4391638" cy="1390844"/>
+                    </a:xfrm>
+                    <a:prstGeom prst="rect">
+                      <a:avLst/>
+                    </a:prstGeom>
+                  </pic:spPr>
+                </pic:pic>
+              </a:graphicData>
+            </a:graphic>
+          </wp:inline>
+        </w:drawing>
+      </w:r>
+    </w:p>
+    <w:p>
+      <w:pPr>
+        <w:spacing w:after="150" w:line="265" w:lineRule="auto"/>
+        <w:rPr>
+          <w:rFonts w:ascii="Times New Roman" w:eastAsia="Times New Roman" w:hAnsi="Times New Roman" w:cs="Times New Roman"/>
+          <w:bCs/>
+          <w:sz w:val="28"/>
+          <w:lang w:val="en-US"/>
+        </w:rPr>
+      </w:pPr>
+      <w:proofErr w:type="spellStart"/>
+      <w:r>
+        <w:rPr>
+          <w:rFonts w:ascii="Times New Roman" w:eastAsia="Times New Roman" w:hAnsi="Times New Roman" w:cs="Times New Roman"/>
+          <w:bCs/>
+          <w:sz w:val="28"/>
+          <w:lang w:val="en-US"/>
+        </w:rPr>
+        <w:t>Для</w:t>
+      </w:r>
+      <w:proofErr w:type="spellEnd"/>
+      <w:r>
+        <w:rPr>
+          <w:rFonts w:ascii="Times New Roman" w:eastAsia="Times New Roman" w:hAnsi="Times New Roman" w:cs="Times New Roman"/>
+          <w:bCs/>
+          <w:sz w:val="28"/>
+          <w:lang w:val="en-US"/>
+        </w:rPr>
+        <w:t xml:space="preserve"> </w:t>
+      </w:r>
+      <w:proofErr w:type="spellStart"/>
+      <w:r>
+        <w:rPr>
+          <w:rFonts w:ascii="Times New Roman" w:eastAsia="Times New Roman" w:hAnsi="Times New Roman" w:cs="Times New Roman"/>
+          <w:bCs/>
+          <w:sz w:val="28"/>
+          <w:lang w:val="en-US"/>
+        </w:rPr>
+        <w:t>студента</w:t>
+      </w:r>
+      <w:proofErr w:type="spellEnd"/>
+      <w:r>
+        <w:rPr>
+          <w:rFonts w:ascii="Times New Roman" w:eastAsia="Times New Roman" w:hAnsi="Times New Roman" w:cs="Times New Roman"/>
+          <w:bCs/>
+          <w:sz w:val="28"/>
+          <w:lang w:val="en-US"/>
+        </w:rPr>
+        <w:t xml:space="preserve"> №2</w:t>
+      </w:r>
+    </w:p>
+    <w:p>
+      <w:pPr>
+        <w:spacing w:after="150" w:line="265" w:lineRule="auto"/>
+        <w:rPr>
+          <w:rFonts w:ascii="Times New Roman" w:eastAsia="Times New Roman" w:hAnsi="Times New Roman" w:cs="Times New Roman"/>
+          <w:bCs/>
+          <w:sz w:val="28"/>
+        </w:rPr>
+      </w:pPr>
+      <w:r>
+        <w:rPr>
+          <w:rFonts w:ascii="Times New Roman" w:eastAsia="Times New Roman" w:hAnsi="Times New Roman" w:cs="Times New Roman"/>
+          <w:bCs/>
+          <w:sz w:val="28"/>
+        </w:rPr>
+        <w:t>Подтвердил свое участие в проекте</w:t>
+      </w:r>
+    </w:p>
+    <w:p>
+      <w:pPr>
+        <w:spacing w:after="150" w:line="265" w:lineRule="auto"/>
+        <w:rPr>
+          <w:rFonts w:ascii="Times New Roman" w:eastAsia="Times New Roman" w:hAnsi="Times New Roman" w:cs="Times New Roman"/>
+          <w:bCs/>
+          <w:sz w:val="28"/>
+        </w:rPr>
+      </w:pPr>
+      <w:r>
+        <w:rPr>
+          <w:rFonts w:ascii="Times New Roman" w:eastAsia="Times New Roman" w:hAnsi="Times New Roman" w:cs="Times New Roman"/>
+          <w:bCs/>
+          <w:sz w:val="28"/>
+        </w:rPr>
+        <w:t xml:space="preserve">Создал локальный репозиторий </w:t>
+      </w:r>
+      <w:proofErr w:type="spellStart"/>
+      <w:r>
+        <w:rPr>
+          <w:rFonts w:ascii="Times New Roman" w:eastAsia="Times New Roman" w:hAnsi="Times New Roman" w:cs="Times New Roman"/>
+          <w:bCs/>
+          <w:sz w:val="28"/>
+        </w:rPr>
+        <w:t>склонировав</w:t>
+      </w:r>
+      <w:proofErr w:type="spellEnd"/>
+      <w:r>
+        <w:rPr>
+          <w:rFonts w:ascii="Times New Roman" w:eastAsia="Times New Roman" w:hAnsi="Times New Roman" w:cs="Times New Roman"/>
+          <w:bCs/>
+          <w:sz w:val="28"/>
+        </w:rPr>
+        <w:t xml:space="preserve"> себе общий репозиторий</w:t>
+      </w:r>
+    </w:p>
+    <w:p>
+      <w:pPr>
+        <w:spacing w:after="150" w:line="265" w:lineRule="auto"/>
+        <w:jc w:val="center"/>
+        <w:rPr>
+          <w:rFonts w:ascii="Times New Roman" w:eastAsia="Times New Roman" w:hAnsi="Times New Roman" w:cs="Times New Roman"/>
+          <w:bCs/>
+          <w:sz w:val="28"/>
+        </w:rPr>
+      </w:pPr>
+      <w:r>
+        <w:rPr>
+          <w:rFonts w:ascii="Times New Roman" w:eastAsia="Times New Roman" w:hAnsi="Times New Roman" w:cs="Times New Roman"/>
+          <w:bCs/>
+          <w:sz w:val="28"/>
+        </w:rPr>
+        <w:drawing>
+          <wp:inline distT="0" distB="0" distL="0" distR="0" wp14:anchorId="21D44BAE" wp14:editId="68680490">
+            <wp:extent cx="4820323" cy="1848108"/>
+            <wp:effectExtent l="0" t="0" r="0" b="0"/>
+            <wp:docPr id="16" name="Рисунок 16"/>
+            <wp:cNvGraphicFramePr>
+              <a:graphicFrameLocks xmlns:a="http://schemas.openxmlformats.org/drawingml/2006/main" noChangeAspect="1"/>
+            </wp:cNvGraphicFramePr>
+            <a:graphic xmlns:a="http://schemas.openxmlformats.org/drawingml/2006/main">
+              <a:graphicData uri="http://schemas.openxmlformats.org/drawingml/2006/picture">
+                <pic:pic xmlns:pic="http://schemas.openxmlformats.org/drawingml/2006/picture">
+                  <pic:nvPicPr>
+                    <pic:cNvPr id="1" name=""/>
+                    <pic:cNvPicPr/>
+                  </pic:nvPicPr>
+                  <pic:blipFill>
+                    <a:blip r:embed="rId24"/>
+                    <a:stretch>
+                      <a:fillRect/>
+                    </a:stretch>
+                  </pic:blipFill>
+                  <pic:spPr>
+                    <a:xfrm>
+                      <a:off x="0" y="0"/>
+                      <a:ext cx="4820323" cy="1848108"/>
+                    </a:xfrm>
+                    <a:prstGeom prst="rect">
+                      <a:avLst/>
+                    </a:prstGeom>
+                  </pic:spPr>
+                </pic:pic>
+              </a:graphicData>
+            </a:graphic>
+          </wp:inline>
+        </w:drawing>
+      </w:r>
+    </w:p>
+    <w:p>
+      <w:pPr>
+        <w:spacing w:after="150" w:line="265" w:lineRule="auto"/>
+        <w:rPr>
+          <w:rFonts w:ascii="Times New Roman" w:eastAsia="Times New Roman" w:hAnsi="Times New Roman" w:cs="Times New Roman"/>
+          <w:bCs/>
+          <w:sz w:val="28"/>
+        </w:rPr>
+      </w:pPr>
+      <w:r>
+        <w:rPr>
+          <w:rFonts w:ascii="Times New Roman" w:eastAsia="Times New Roman" w:hAnsi="Times New Roman" w:cs="Times New Roman"/>
+          <w:bCs/>
+          <w:sz w:val="28"/>
+        </w:rPr>
+        <w:t>Создал новую ветку со своей фамилией и перешел в нее</w:t>
+      </w:r>
+    </w:p>
+    <w:p>
+      <w:pPr>
+        <w:spacing w:after="150" w:line="265" w:lineRule="auto"/>
+        <w:jc w:val="center"/>
+        <w:rPr>
+          <w:rFonts w:ascii="Times New Roman" w:eastAsia="Times New Roman" w:hAnsi="Times New Roman" w:cs="Times New Roman"/>
+          <w:bCs/>
+          <w:sz w:val="28"/>
+          <w:lang w:val="en-US"/>
+        </w:rPr>
+      </w:pPr>
+      <w:r>
+        <w:rPr>
+          <w:rFonts w:ascii="Times New Roman" w:eastAsia="Times New Roman" w:hAnsi="Times New Roman" w:cs="Times New Roman"/>
+          <w:bCs/>
+          <w:sz w:val="28"/>
+          <w:lang w:val="en-US"/>
+        </w:rPr>
+        <w:drawing>
+          <wp:inline distT="0" distB="0" distL="0" distR="0" wp14:anchorId="49CDE6F5" wp14:editId="7B2220CA">
+            <wp:extent cx="4458322" cy="476316"/>
+            <wp:effectExtent l="0" t="0" r="0" b="0"/>
+            <wp:docPr id="18" name="Рисунок 18"/>
+            <wp:cNvGraphicFramePr>
+              <a:graphicFrameLocks xmlns:a="http://schemas.openxmlformats.org/drawingml/2006/main" noChangeAspect="1"/>
+            </wp:cNvGraphicFramePr>
+            <a:graphic xmlns:a="http://schemas.openxmlformats.org/drawingml/2006/main">
+              <a:graphicData uri="http://schemas.openxmlformats.org/drawingml/2006/picture">
+                <pic:pic xmlns:pic="http://schemas.openxmlformats.org/drawingml/2006/picture">
+                  <pic:nvPicPr>
+                    <pic:cNvPr id="1" name=""/>
+                    <pic:cNvPicPr/>
+                  </pic:nvPicPr>
+                  <pic:blipFill>
+                    <a:blip r:embed="rId25"/>
+                    <a:stretch>
+                      <a:fillRect/>
+                    </a:stretch>
+                  </pic:blipFill>
+                  <pic:spPr>
+                    <a:xfrm>
+                      <a:off x="0" y="0"/>
+                      <a:ext cx="4458322" cy="476316"/>
+                    </a:xfrm>
+                    <a:prstGeom prst="rect">
+                      <a:avLst/>
+                    </a:prstGeom>
+                  </pic:spPr>
+                </pic:pic>
+              </a:graphicData>
+            </a:graphic>
+          </wp:inline>
+        </w:drawing>
+      </w:r>
+    </w:p>
+    <w:p>
+      <w:pPr>
+        <w:spacing w:after="150" w:line="265" w:lineRule="auto"/>
+        <w:rPr>
+          <w:rFonts w:ascii="Times New Roman" w:eastAsia="Times New Roman" w:hAnsi="Times New Roman" w:cs="Times New Roman"/>
+          <w:bCs/>
+          <w:sz w:val="28"/>
+        </w:rPr>
+      </w:pPr>
+      <w:r>
+        <w:rPr>
+          <w:rFonts w:ascii="Times New Roman" w:eastAsia="Times New Roman" w:hAnsi="Times New Roman" w:cs="Times New Roman"/>
+          <w:bCs/>
+          <w:sz w:val="28"/>
+        </w:rPr>
+        <w:t xml:space="preserve">Ввиду отсутствия файлов самого проекта, будут внесены изменения в отчет по лабораторной работе </w:t>
+      </w:r>
+    </w:p>
+    <w:p>
+      <w:pPr>
+        <w:spacing w:after="150" w:line="265" w:lineRule="auto"/>
+        <w:rPr>
+          <w:rFonts w:ascii="Times New Roman" w:eastAsia="Times New Roman" w:hAnsi="Times New Roman" w:cs="Times New Roman"/>
+          <w:bCs/>
+          <w:sz w:val="28"/>
+        </w:rPr>
+      </w:pPr>
+      <w:r>
+        <w:rPr>
+          <w:rFonts w:ascii="Times New Roman" w:eastAsia="Times New Roman" w:hAnsi="Times New Roman" w:cs="Times New Roman"/>
+          <w:bCs/>
+          <w:sz w:val="28"/>
+        </w:rPr>
+        <w:t>Внес изменения в отчет лабораторной работы и зафиксировал каждое изменение</w:t>
+      </w:r>
+    </w:p>
+    <w:p>
+      <w:pPr>
+        <w:spacing w:after="150" w:line="265" w:lineRule="auto"/>
+        <w:jc w:val="center"/>
+        <w:rPr>
+          <w:rFonts w:ascii="Times New Roman" w:eastAsia="Times New Roman" w:hAnsi="Times New Roman" w:cs="Times New Roman"/>
+          <w:bCs/>
+          <w:sz w:val="28"/>
+        </w:rPr>
+      </w:pPr>
+      <w:r>
+        <w:rPr>
+          <w:rFonts w:ascii="Times New Roman" w:eastAsia="Times New Roman" w:hAnsi="Times New Roman" w:cs="Times New Roman"/>
+          <w:bCs/>
+          <w:sz w:val="28"/>
+        </w:rPr>
+        <w:lastRenderedPageBreak/>
+        <w:drawing>
+          <wp:inline distT="0" distB="0" distL="0" distR="0" wp14:anchorId="4A2E7CBC" wp14:editId="747418E0">
+            <wp:extent cx="4801270" cy="2124371"/>
+            <wp:effectExtent l="0" t="0" r="0" b="9525"/>
+            <wp:docPr id="19" name="Рисунок 19"/>
+            <wp:cNvGraphicFramePr>
+              <a:graphicFrameLocks xmlns:a="http://schemas.openxmlformats.org/drawingml/2006/main" noChangeAspect="1"/>
+            </wp:cNvGraphicFramePr>
+            <a:graphic xmlns:a="http://schemas.openxmlformats.org/drawingml/2006/main">
+              <a:graphicData uri="http://schemas.openxmlformats.org/drawingml/2006/picture">
+                <pic:pic xmlns:pic="http://schemas.openxmlformats.org/drawingml/2006/picture">
+                  <pic:nvPicPr>
+                    <pic:cNvPr id="1" name=""/>
+                    <pic:cNvPicPr/>
+                  </pic:nvPicPr>
+                  <pic:blipFill>
+                    <a:blip r:embed="rId26"/>
+                    <a:stretch>
+                      <a:fillRect/>
+                    </a:stretch>
+                  </pic:blipFill>
+                  <pic:spPr>
+                    <a:xfrm>
+                      <a:off x="0" y="0"/>
+                      <a:ext cx="4801270" cy="2124371"/>
+                    </a:xfrm>
+                    <a:prstGeom prst="rect">
+                      <a:avLst/>
+                    </a:prstGeom>
+                  </pic:spPr>
+                </pic:pic>
+              </a:graphicData>
+            </a:graphic>
+          </wp:inline>
+        </w:drawing>
+      </w:r>
+    </w:p>
+    <w:p>
+      <w:pPr>
+        <w:spacing w:after="150" w:line="265" w:lineRule="auto"/>
+        <w:rPr>
+          <w:rFonts w:ascii="Times New Roman" w:eastAsia="Times New Roman" w:hAnsi="Times New Roman" w:cs="Times New Roman"/>
+          <w:bCs/>
+          <w:sz w:val="28"/>
+        </w:rPr>
+      </w:pPr>
+      <w:r>
+        <w:rPr>
+          <w:rFonts w:ascii="Times New Roman" w:eastAsia="Times New Roman" w:hAnsi="Times New Roman" w:cs="Times New Roman"/>
+          <w:bCs/>
+          <w:sz w:val="28"/>
+          <w:lang w:val="en-US"/>
+        </w:rPr>
+        <w:t>C</w:t>
+      </w:r>
+      <w:r>
+        <w:rPr>
+          <w:rFonts w:ascii="Times New Roman" w:eastAsia="Times New Roman" w:hAnsi="Times New Roman" w:cs="Times New Roman"/>
+          <w:bCs/>
+          <w:sz w:val="28"/>
+        </w:rPr>
+        <w:t>озда</w:t>
+      </w:r>
+      <w:r>
+        <w:rPr>
+          <w:rFonts w:ascii="Times New Roman" w:eastAsia="Times New Roman" w:hAnsi="Times New Roman" w:cs="Times New Roman"/>
+          <w:bCs/>
+          <w:sz w:val="28"/>
+        </w:rPr>
+        <w:t>л</w:t>
+      </w:r>
+      <w:r>
+        <w:rPr>
+          <w:rFonts w:ascii="Times New Roman" w:eastAsia="Times New Roman" w:hAnsi="Times New Roman" w:cs="Times New Roman"/>
+          <w:bCs/>
+          <w:sz w:val="28"/>
+        </w:rPr>
+        <w:t xml:space="preserve"> в своей ветке файл 2.docx в котором опи</w:t>
+      </w:r>
+      <w:r>
+        <w:rPr>
+          <w:rFonts w:ascii="Times New Roman" w:eastAsia="Times New Roman" w:hAnsi="Times New Roman" w:cs="Times New Roman"/>
+          <w:bCs/>
+          <w:sz w:val="28"/>
+        </w:rPr>
+        <w:t>сал свои</w:t>
+      </w:r>
+      <w:r>
+        <w:rPr>
+          <w:rFonts w:ascii="Times New Roman" w:eastAsia="Times New Roman" w:hAnsi="Times New Roman" w:cs="Times New Roman"/>
+          <w:bCs/>
+          <w:sz w:val="28"/>
+        </w:rPr>
+        <w:t xml:space="preserve"> действия, добавив</w:t>
+      </w:r>
+    </w:p>
+    <w:p>
+      <w:pPr>
+        <w:spacing w:after="150" w:line="265" w:lineRule="auto"/>
+        <w:rPr>
+          <w:rFonts w:ascii="Times New Roman" w:eastAsia="Times New Roman" w:hAnsi="Times New Roman" w:cs="Times New Roman"/>
+          <w:bCs/>
+          <w:sz w:val="28"/>
+        </w:rPr>
+      </w:pPr>
+      <w:r>
+        <w:rPr>
+          <w:rFonts w:ascii="Times New Roman" w:eastAsia="Times New Roman" w:hAnsi="Times New Roman" w:cs="Times New Roman"/>
+          <w:bCs/>
+          <w:sz w:val="28"/>
+        </w:rPr>
+        <w:t xml:space="preserve">соответствующие скрины, в том числе скрины из консоли </w:t>
+      </w:r>
+      <w:proofErr w:type="spellStart"/>
+      <w:r>
+        <w:rPr>
+          <w:rFonts w:ascii="Times New Roman" w:eastAsia="Times New Roman" w:hAnsi="Times New Roman" w:cs="Times New Roman"/>
+          <w:bCs/>
+          <w:sz w:val="28"/>
+        </w:rPr>
+        <w:t>git</w:t>
+      </w:r>
+      <w:proofErr w:type="spellEnd"/>
+      <w:r>
+        <w:rPr>
+          <w:rFonts w:ascii="Times New Roman" w:eastAsia="Times New Roman" w:hAnsi="Times New Roman" w:cs="Times New Roman"/>
+          <w:bCs/>
+          <w:sz w:val="28"/>
+        </w:rPr>
+        <w:t>.</w:t>
+      </w:r>
+    </w:p>
+    <w:p>
+      <w:pPr>
+        <w:spacing w:after="150" w:line="265" w:lineRule="auto"/>
+        <w:rPr>
+          <w:rFonts w:ascii="Times New Roman" w:eastAsia="Times New Roman" w:hAnsi="Times New Roman" w:cs="Times New Roman"/>
+          <w:bCs/>
+          <w:sz w:val="28"/>
+        </w:rPr>
+      </w:pPr>
+      <w:r>
+        <w:rPr>
+          <w:rFonts w:ascii="Times New Roman" w:eastAsia="Times New Roman" w:hAnsi="Times New Roman" w:cs="Times New Roman"/>
+          <w:bCs/>
+          <w:sz w:val="28"/>
+        </w:rPr>
+        <w:drawing>
+          <wp:inline distT="0" distB="0" distL="0" distR="0" wp14:anchorId="489EB989" wp14:editId="6120525C">
+            <wp:extent cx="5841365" cy="2667000"/>
+            <wp:effectExtent l="0" t="0" r="6985" b="0"/>
+            <wp:docPr id="20" name="Рисунок 20"/>
+            <wp:cNvGraphicFramePr>
+              <a:graphicFrameLocks xmlns:a="http://schemas.openxmlformats.org/drawingml/2006/main" noChangeAspect="1"/>
+            </wp:cNvGraphicFramePr>
+            <a:graphic xmlns:a="http://schemas.openxmlformats.org/drawingml/2006/main">
+              <a:graphicData uri="http://schemas.openxmlformats.org/drawingml/2006/picture">
+                <pic:pic xmlns:pic="http://schemas.openxmlformats.org/drawingml/2006/picture">
+                  <pic:nvPicPr>
+                    <pic:cNvPr id="1" name=""/>
+                    <pic:cNvPicPr/>
+                  </pic:nvPicPr>
+                  <pic:blipFill>
+                    <a:blip r:embed="rId27"/>
+                    <a:stretch>
+                      <a:fillRect/>
+                    </a:stretch>
+                  </pic:blipFill>
+                  <pic:spPr>
+                    <a:xfrm>
+                      <a:off x="0" y="0"/>
+                      <a:ext cx="5841365" cy="2667000"/>
+                    </a:xfrm>
+                    <a:prstGeom prst="rect">
+                      <a:avLst/>
+                    </a:prstGeom>
+                  </pic:spPr>
+                </pic:pic>
+              </a:graphicData>
+            </a:graphic>
+          </wp:inline>
+        </w:drawing>
+      </w:r>
+    </w:p>
+    <w:p>
+      <w:pPr>
+        <w:spacing w:after="150" w:line="265" w:lineRule="auto"/>
+        <w:rPr>
+          <w:rFonts w:ascii="Times New Roman" w:eastAsia="Times New Roman" w:hAnsi="Times New Roman" w:cs="Times New Roman"/>
+          <w:bCs/>
+          <w:sz w:val="28"/>
+        </w:rPr>
+      </w:pPr>
+      <w:r>
+        <w:rPr>
+          <w:rFonts w:ascii="Times New Roman" w:eastAsia="Times New Roman" w:hAnsi="Times New Roman" w:cs="Times New Roman"/>
+          <w:bCs/>
+          <w:sz w:val="28"/>
+        </w:rPr>
+        <w:t>Зафиксировал добавление файла</w:t>
+      </w:r>
+    </w:p>
+    <w:p>
+      <w:pPr>
+        <w:spacing w:after="150" w:line="265" w:lineRule="auto"/>
+        <w:jc w:val="center"/>
+        <w:rPr>
+          <w:rFonts w:ascii="Times New Roman" w:eastAsia="Times New Roman" w:hAnsi="Times New Roman" w:cs="Times New Roman"/>
+          <w:bCs/>
+          <w:sz w:val="28"/>
+          <w:lang w:val="en-US"/>
+        </w:rPr>
+      </w:pPr>
+      <w:r>
+        <w:rPr>
+          <w:rFonts w:ascii="Times New Roman" w:eastAsia="Times New Roman" w:hAnsi="Times New Roman" w:cs="Times New Roman"/>
+          <w:bCs/>
+          <w:sz w:val="28"/>
+          <w:lang w:val="en-US"/>
+        </w:rPr>
+        <w:drawing>
+          <wp:inline distT="0" distB="0" distL="0" distR="0" wp14:anchorId="3CF4A5B8" wp14:editId="1086628E">
+            <wp:extent cx="4858428" cy="1124107"/>
+            <wp:effectExtent l="0" t="0" r="0" b="0"/>
+            <wp:docPr id="25" name="Рисунок 25"/>
+            <wp:cNvGraphicFramePr>
+              <a:graphicFrameLocks xmlns:a="http://schemas.openxmlformats.org/drawingml/2006/main" noChangeAspect="1"/>
+            </wp:cNvGraphicFramePr>
+            <a:graphic xmlns:a="http://schemas.openxmlformats.org/drawingml/2006/main">
+              <a:graphicData uri="http://schemas.openxmlformats.org/drawingml/2006/picture">
+                <pic:pic xmlns:pic="http://schemas.openxmlformats.org/drawingml/2006/picture">
+                  <pic:nvPicPr>
+                    <pic:cNvPr id="1" name=""/>
+                    <pic:cNvPicPr/>
+                  </pic:nvPicPr>
+                  <pic:blipFill>
+                    <a:blip r:embed="rId28"/>
+                    <a:stretch>
+                      <a:fillRect/>
+                    </a:stretch>
+                  </pic:blipFill>
+                  <pic:spPr>
+                    <a:xfrm>
+                      <a:off x="0" y="0"/>
+                      <a:ext cx="4858428" cy="1124107"/>
+                    </a:xfrm>
+                    <a:prstGeom prst="rect">
+                      <a:avLst/>
+                    </a:prstGeom>
+                  </pic:spPr>
+                </pic:pic>
+              </a:graphicData>
+            </a:graphic>
+          </wp:inline>
+        </w:drawing>
+      </w:r>
+    </w:p>
+    <w:p>
+      <w:pPr>
+        <w:spacing w:after="150" w:line="265" w:lineRule="auto"/>
+        <w:rPr>
+          <w:rFonts w:ascii="Times New Roman" w:eastAsia="Times New Roman" w:hAnsi="Times New Roman" w:cs="Times New Roman"/>
+          <w:bCs/>
+          <w:sz w:val="28"/>
+        </w:rPr>
+      </w:pPr>
+      <w:r>
+        <w:rPr>
+          <w:rFonts w:ascii="Times New Roman" w:eastAsia="Times New Roman" w:hAnsi="Times New Roman" w:cs="Times New Roman"/>
+          <w:bCs/>
+          <w:sz w:val="28"/>
+        </w:rPr>
+        <w:t>О</w:t>
+      </w:r>
+      <w:r>
+        <w:rPr>
+          <w:rFonts w:ascii="Times New Roman" w:eastAsia="Times New Roman" w:hAnsi="Times New Roman" w:cs="Times New Roman"/>
+          <w:bCs/>
+          <w:sz w:val="28"/>
+        </w:rPr>
+        <w:t>тправ</w:t>
+      </w:r>
+      <w:r>
+        <w:rPr>
+          <w:rFonts w:ascii="Times New Roman" w:eastAsia="Times New Roman" w:hAnsi="Times New Roman" w:cs="Times New Roman"/>
+          <w:bCs/>
+          <w:sz w:val="28"/>
+        </w:rPr>
+        <w:t>ил</w:t>
+      </w:r>
+      <w:r>
+        <w:rPr>
+          <w:rFonts w:ascii="Times New Roman" w:eastAsia="Times New Roman" w:hAnsi="Times New Roman" w:cs="Times New Roman"/>
+          <w:bCs/>
+          <w:sz w:val="28"/>
+        </w:rPr>
+        <w:t xml:space="preserve"> зафиксированные изменения в удаленный репозиторий в</w:t>
+      </w:r>
+    </w:p>
+    <w:p>
+      <w:pPr>
+        <w:spacing w:after="150" w:line="265" w:lineRule="auto"/>
+        <w:rPr>
+          <w:rFonts w:ascii="Times New Roman" w:eastAsia="Times New Roman" w:hAnsi="Times New Roman" w:cs="Times New Roman"/>
+          <w:bCs/>
+          <w:sz w:val="28"/>
+          <w:lang w:val="en-US"/>
+        </w:rPr>
+      </w:pPr>
+      <w:r>
+        <w:rPr>
+          <w:rFonts w:ascii="Times New Roman" w:eastAsia="Times New Roman" w:hAnsi="Times New Roman" w:cs="Times New Roman"/>
+          <w:bCs/>
+          <w:sz w:val="28"/>
+        </w:rPr>
+        <w:t>свою ветку</w:t>
+      </w:r>
+    </w:p>
+    <w:p>
+      <w:pPr>
+        <w:spacing w:after="150" w:line="265" w:lineRule="auto"/>
+        <w:jc w:val="center"/>
+        <w:rPr>
+          <w:rFonts w:ascii="Times New Roman" w:eastAsia="Times New Roman" w:hAnsi="Times New Roman" w:cs="Times New Roman"/>
+          <w:bCs/>
+          <w:sz w:val="28"/>
+          <w:lang w:val="en-US"/>
+        </w:rPr>
+      </w:pPr>
+      <w:r>
+        <w:rPr>
+          <w:rFonts w:ascii="Times New Roman" w:eastAsia="Times New Roman" w:hAnsi="Times New Roman" w:cs="Times New Roman"/>
+          <w:bCs/>
+          <w:sz w:val="28"/>
+          <w:lang w:val="en-US"/>
+        </w:rPr>
+        <w:lastRenderedPageBreak/>
+        <w:drawing>
+          <wp:inline distT="0" distB="0" distL="0" distR="0" wp14:anchorId="34D8A3FC" wp14:editId="7617DD26">
+            <wp:extent cx="4820323" cy="2105319"/>
+            <wp:effectExtent l="0" t="0" r="0" b="9525"/>
+            <wp:docPr id="26" name="Рисунок 26"/>
+            <wp:cNvGraphicFramePr>
+              <a:graphicFrameLocks xmlns:a="http://schemas.openxmlformats.org/drawingml/2006/main" noChangeAspect="1"/>
+            </wp:cNvGraphicFramePr>
+            <a:graphic xmlns:a="http://schemas.openxmlformats.org/drawingml/2006/main">
+              <a:graphicData uri="http://schemas.openxmlformats.org/drawingml/2006/picture">
+                <pic:pic xmlns:pic="http://schemas.openxmlformats.org/drawingml/2006/picture">
+                  <pic:nvPicPr>
+                    <pic:cNvPr id="1" name=""/>
+                    <pic:cNvPicPr/>
+                  </pic:nvPicPr>
+                  <pic:blipFill>
+                    <a:blip r:embed="rId29"/>
+                    <a:stretch>
+                      <a:fillRect/>
+                    </a:stretch>
+                  </pic:blipFill>
+                  <pic:spPr>
+                    <a:xfrm>
+                      <a:off x="0" y="0"/>
+                      <a:ext cx="4820323" cy="2105319"/>
+                    </a:xfrm>
+                    <a:prstGeom prst="rect">
+                      <a:avLst/>
+                    </a:prstGeom>
+                  </pic:spPr>
+                </pic:pic>
+              </a:graphicData>
+            </a:graphic>
+          </wp:inline>
+        </w:drawing>
+      </w:r>
+    </w:p>
+    <w:p>
+      <w:pPr>
+        <w:spacing w:after="150" w:line="265" w:lineRule="auto"/>
+        <w:rPr>
+          <w:rFonts w:ascii="Times New Roman" w:eastAsia="Times New Roman" w:hAnsi="Times New Roman" w:cs="Times New Roman"/>
+          <w:bCs/>
+          <w:sz w:val="28"/>
+        </w:rPr>
+      </w:pPr>
+      <w:r>
+        <w:rPr>
+          <w:rFonts w:ascii="Times New Roman" w:eastAsia="Times New Roman" w:hAnsi="Times New Roman" w:cs="Times New Roman"/>
+          <w:bCs/>
+          <w:sz w:val="28"/>
+        </w:rPr>
+        <w:t xml:space="preserve">Выполнил слияние с веткой </w:t>
+      </w:r>
+      <w:r>
+        <w:rPr>
+          <w:rFonts w:ascii="Times New Roman" w:eastAsia="Times New Roman" w:hAnsi="Times New Roman" w:cs="Times New Roman"/>
+          <w:bCs/>
+          <w:sz w:val="28"/>
+          <w:lang w:val="en-US"/>
+        </w:rPr>
+        <w:t>master</w:t>
+      </w:r>
+    </w:p>
+    <w:p>
+      <w:pPr>
+        <w:spacing w:after="150" w:line="265" w:lineRule="auto"/>
+        <w:jc w:val="center"/>
+        <w:rPr>
+          <w:rFonts w:ascii="Times New Roman" w:eastAsia="Times New Roman" w:hAnsi="Times New Roman" w:cs="Times New Roman"/>
+          <w:bCs/>
+          <w:sz w:val="28"/>
+          <w:lang w:val="en-US"/>
+        </w:rPr>
+      </w:pPr>
+      <w:r>
+        <w:rPr>
+          <w:rFonts w:ascii="Times New Roman" w:eastAsia="Times New Roman" w:hAnsi="Times New Roman" w:cs="Times New Roman"/>
+          <w:bCs/>
+          <w:sz w:val="28"/>
+          <w:lang w:val="en-US"/>
+        </w:rPr>
+        <w:drawing>
+          <wp:inline distT="0" distB="0" distL="0" distR="0" wp14:anchorId="2610328E" wp14:editId="56703E03">
+            <wp:extent cx="4505954" cy="1181265"/>
+            <wp:effectExtent l="0" t="0" r="9525" b="0"/>
+            <wp:docPr id="27" name="Рисунок 27"/>
+            <wp:cNvGraphicFramePr>
+              <a:graphicFrameLocks xmlns:a="http://schemas.openxmlformats.org/drawingml/2006/main" noChangeAspect="1"/>
+            </wp:cNvGraphicFramePr>
+            <a:graphic xmlns:a="http://schemas.openxmlformats.org/drawingml/2006/main">
+              <a:graphicData uri="http://schemas.openxmlformats.org/drawingml/2006/picture">
+                <pic:pic xmlns:pic="http://schemas.openxmlformats.org/drawingml/2006/picture">
+                  <pic:nvPicPr>
+                    <pic:cNvPr id="1" name=""/>
+                    <pic:cNvPicPr/>
+                  </pic:nvPicPr>
+                  <pic:blipFill>
+                    <a:blip r:embed="rId30"/>
+                    <a:stretch>
+                      <a:fillRect/>
+                    </a:stretch>
+                  </pic:blipFill>
+                  <pic:spPr>
+                    <a:xfrm>
+                      <a:off x="0" y="0"/>
+                      <a:ext cx="4505954" cy="1181265"/>
+                    </a:xfrm>
+                    <a:prstGeom prst="rect">
+                      <a:avLst/>
+                    </a:prstGeom>
+                  </pic:spPr>
+                </pic:pic>
+              </a:graphicData>
+            </a:graphic>
+          </wp:inline>
+        </w:drawing>
+      </w:r>
+    </w:p>
+    <w:p>
+      <w:pPr>
+        <w:spacing w:after="150" w:line="265" w:lineRule="auto"/>
+        <w:jc w:val="center"/>
+        <w:rPr>
+          <w:rFonts w:ascii="Times New Roman" w:eastAsia="Times New Roman" w:hAnsi="Times New Roman" w:cs="Times New Roman"/>
+          <w:bCs/>
+          <w:sz w:val="28"/>
+          <w:lang w:val="en-US"/>
+        </w:rPr>
+      </w:pPr>
+      <w:r>
+        <w:rPr>
+          <w:rFonts w:ascii="Times New Roman" w:eastAsia="Times New Roman" w:hAnsi="Times New Roman" w:cs="Times New Roman"/>
+          <w:bCs/>
+          <w:sz w:val="28"/>
+          <w:lang w:val="en-US"/>
+        </w:rPr>
+        <w:drawing>
+          <wp:inline distT="0" distB="0" distL="0" distR="0" wp14:anchorId="0D20E84C" wp14:editId="427C6C6C">
+            <wp:extent cx="4496427" cy="724001"/>
+            <wp:effectExtent l="0" t="0" r="0" b="0"/>
+            <wp:docPr id="28" name="Рисунок 28"/>
+            <wp:cNvGraphicFramePr>
+              <a:graphicFrameLocks xmlns:a="http://schemas.openxmlformats.org/drawingml/2006/main" noChangeAspect="1"/>
+            </wp:cNvGraphicFramePr>
+            <a:graphic xmlns:a="http://schemas.openxmlformats.org/drawingml/2006/main">
+              <a:graphicData uri="http://schemas.openxmlformats.org/drawingml/2006/picture">
+                <pic:pic xmlns:pic="http://schemas.openxmlformats.org/drawingml/2006/picture">
+                  <pic:nvPicPr>
+                    <pic:cNvPr id="1" name=""/>
+                    <pic:cNvPicPr/>
+                  </pic:nvPicPr>
+                  <pic:blipFill>
+                    <a:blip r:embed="rId31"/>
+                    <a:stretch>
+                      <a:fillRect/>
+                    </a:stretch>
+                  </pic:blipFill>
+                  <pic:spPr>
+                    <a:xfrm>
+                      <a:off x="0" y="0"/>
+                      <a:ext cx="4496427" cy="724001"/>
+                    </a:xfrm>
+                    <a:prstGeom prst="rect">
+                      <a:avLst/>
+                    </a:prstGeom>
+                  </pic:spPr>
+                </pic:pic>
+              </a:graphicData>
+            </a:graphic>
+          </wp:inline>
+        </w:drawing>
+      </w:r>
+    </w:p>
+    <w:p>
+      <w:pPr>
+        <w:spacing w:after="150" w:line="265" w:lineRule="auto"/>
+        <w:rPr>
+          <w:rFonts w:ascii="Times New Roman" w:eastAsia="Times New Roman" w:hAnsi="Times New Roman" w:cs="Times New Roman"/>
+          <w:bCs/>
+          <w:sz w:val="28"/>
+        </w:rPr>
+      </w:pPr>
+      <w:r>
+        <w:rPr>
+          <w:rFonts w:ascii="Times New Roman" w:eastAsia="Times New Roman" w:hAnsi="Times New Roman" w:cs="Times New Roman"/>
+          <w:bCs/>
+          <w:sz w:val="28"/>
+        </w:rPr>
+        <w:t>Этап 3 (заключительный</w:t>
+      </w:r>
+      <w:proofErr w:type="gramStart"/>
+      <w:r>
+        <w:rPr>
+          <w:rFonts w:ascii="Times New Roman" w:eastAsia="Times New Roman" w:hAnsi="Times New Roman" w:cs="Times New Roman"/>
+          <w:bCs/>
+          <w:sz w:val="28"/>
+        </w:rPr>
+        <w:t>)</w:t>
+      </w:r>
+      <w:r>
+        <w:rPr>
+          <w:rFonts w:ascii="Times New Roman" w:eastAsia="Times New Roman" w:hAnsi="Times New Roman" w:cs="Times New Roman"/>
+          <w:bCs/>
+          <w:sz w:val="28"/>
+        </w:rPr>
+        <w:t>(</w:t>
+      </w:r>
+      <w:proofErr w:type="gramEnd"/>
+      <w:r>
+        <w:rPr>
+          <w:rFonts w:ascii="Times New Roman" w:eastAsia="Times New Roman" w:hAnsi="Times New Roman" w:cs="Times New Roman"/>
+          <w:bCs/>
+          <w:sz w:val="28"/>
+        </w:rPr>
+        <w:t>Студент №1).</w:t>
+      </w:r>
+    </w:p>
+    <w:p>
+      <w:pPr>
+        <w:spacing w:after="150" w:line="265" w:lineRule="auto"/>
+        <w:rPr>
+          <w:rFonts w:ascii="Times New Roman" w:eastAsia="Times New Roman" w:hAnsi="Times New Roman" w:cs="Times New Roman"/>
+          <w:bCs/>
+          <w:sz w:val="28"/>
+        </w:rPr>
+      </w:pPr>
+      <w:r>
+        <w:rPr>
+          <w:rFonts w:ascii="Times New Roman" w:eastAsia="Times New Roman" w:hAnsi="Times New Roman" w:cs="Times New Roman"/>
+          <w:bCs/>
+          <w:sz w:val="28"/>
+        </w:rPr>
+        <w:t>П</w:t>
+      </w:r>
+      <w:r>
+        <w:rPr>
+          <w:rFonts w:ascii="Times New Roman" w:eastAsia="Times New Roman" w:hAnsi="Times New Roman" w:cs="Times New Roman"/>
+          <w:bCs/>
+          <w:sz w:val="28"/>
+        </w:rPr>
+        <w:t>олучи</w:t>
+      </w:r>
+      <w:r>
+        <w:rPr>
+          <w:rFonts w:ascii="Times New Roman" w:eastAsia="Times New Roman" w:hAnsi="Times New Roman" w:cs="Times New Roman"/>
+          <w:bCs/>
+          <w:sz w:val="28"/>
+        </w:rPr>
+        <w:t>л</w:t>
+      </w:r>
+      <w:r>
+        <w:rPr>
+          <w:rFonts w:ascii="Times New Roman" w:eastAsia="Times New Roman" w:hAnsi="Times New Roman" w:cs="Times New Roman"/>
+          <w:bCs/>
+          <w:sz w:val="28"/>
+        </w:rPr>
+        <w:t xml:space="preserve"> все добавленные изменения в свой локальный репозиторий</w:t>
+      </w:r>
+    </w:p>
+    <w:p>
+      <w:pPr>
+        <w:spacing w:after="150" w:line="265" w:lineRule="auto"/>
+        <w:jc w:val="center"/>
+        <w:rPr>
+          <w:rFonts w:ascii="Times New Roman" w:eastAsia="Times New Roman" w:hAnsi="Times New Roman" w:cs="Times New Roman"/>
+          <w:bCs/>
+          <w:sz w:val="28"/>
+        </w:rPr>
+      </w:pPr>
+      <w:r>
+        <w:rPr>
+          <w:rFonts w:ascii="Times New Roman" w:eastAsia="Times New Roman" w:hAnsi="Times New Roman" w:cs="Times New Roman"/>
+          <w:bCs/>
+          <w:sz w:val="28"/>
+        </w:rPr>
+        <w:drawing>
+          <wp:inline distT="0" distB="0" distL="0" distR="0" wp14:anchorId="3CEB406E" wp14:editId="281395CE">
+            <wp:extent cx="4401164" cy="562053"/>
+            <wp:effectExtent l="0" t="0" r="0" b="9525"/>
+            <wp:docPr id="29" name="Рисунок 29"/>
+            <wp:cNvGraphicFramePr>
+              <a:graphicFrameLocks xmlns:a="http://schemas.openxmlformats.org/drawingml/2006/main" noChangeAspect="1"/>
+            </wp:cNvGraphicFramePr>
+            <a:graphic xmlns:a="http://schemas.openxmlformats.org/drawingml/2006/main">
+              <a:graphicData uri="http://schemas.openxmlformats.org/drawingml/2006/picture">
+                <pic:pic xmlns:pic="http://schemas.openxmlformats.org/drawingml/2006/picture">
+                  <pic:nvPicPr>
+                    <pic:cNvPr id="1" name=""/>
+                    <pic:cNvPicPr/>
+                  </pic:nvPicPr>
+                  <pic:blipFill>
+                    <a:blip r:embed="rId32"/>
+                    <a:stretch>
+                      <a:fillRect/>
+                    </a:stretch>
+                  </pic:blipFill>
+                  <pic:spPr>
+                    <a:xfrm>
+                      <a:off x="0" y="0"/>
+                      <a:ext cx="4401164" cy="562053"/>
+                    </a:xfrm>
+                    <a:prstGeom prst="rect">
+                      <a:avLst/>
+                    </a:prstGeom>
+                  </pic:spPr>
+                </pic:pic>
+              </a:graphicData>
+            </a:graphic>
+          </wp:inline>
+        </w:drawing>
+      </w:r>
+    </w:p>
+    <w:p>
+      <w:pPr>
+        <w:spacing w:after="150" w:line="265" w:lineRule="auto"/>
+        <w:rPr>
+          <w:rFonts w:ascii="Times New Roman" w:eastAsia="Times New Roman" w:hAnsi="Times New Roman" w:cs="Times New Roman"/>
+          <w:bCs/>
+          <w:sz w:val="28"/>
+        </w:rPr>
+      </w:pPr>
+      <w:r>
+        <w:rPr>
+          <w:rFonts w:ascii="Times New Roman" w:eastAsia="Times New Roman" w:hAnsi="Times New Roman" w:cs="Times New Roman"/>
+          <w:bCs/>
+          <w:sz w:val="28"/>
+        </w:rPr>
+        <w:t>Оформил отчет и зафиксировал изменения</w:t>
       </w:r>
     </w:p>
     <w:p>

</xml_diff>

<commit_message>
Added link to public repository
</commit_message>
<xml_diff>
--- a/9.docx
+++ b/9.docx
@@ -1165,33 +1165,15 @@
           <w:bCs/>
           <w:sz w:val="28"/>
         </w:rPr>
-        <w:t>Этап 1 (подготовительный</w:t>
-      </w:r>
-      <w:proofErr w:type="gramStart"/>
-      <w:r>
-        <w:rPr>
-          <w:rFonts w:ascii="Times New Roman" w:eastAsia="Times New Roman" w:hAnsi="Times New Roman" w:cs="Times New Roman"/>
-          <w:bCs/>
-          <w:sz w:val="28"/>
-        </w:rPr>
-        <w:t>)</w:t>
-      </w:r>
-      <w:r>
-        <w:rPr>
-          <w:rFonts w:ascii="Times New Roman" w:eastAsia="Times New Roman" w:hAnsi="Times New Roman" w:cs="Times New Roman"/>
-          <w:bCs/>
-          <w:sz w:val="28"/>
-        </w:rPr>
-        <w:t>(</w:t>
-      </w:r>
-      <w:proofErr w:type="gramEnd"/>
-      <w:r>
-        <w:rPr>
-          <w:rFonts w:ascii="Times New Roman" w:eastAsia="Times New Roman" w:hAnsi="Times New Roman" w:cs="Times New Roman"/>
-          <w:bCs/>
-          <w:sz w:val="28"/>
-        </w:rPr>
-        <w:t>Студент №1)</w:t>
+        <w:t>Этап 1 (подготовительный)</w:t>
+      </w:r>
+      <w:r>
+        <w:rPr>
+          <w:rFonts w:ascii="Times New Roman" w:eastAsia="Times New Roman" w:hAnsi="Times New Roman" w:cs="Times New Roman"/>
+          <w:bCs/>
+          <w:sz w:val="28"/>
+        </w:rPr>
+        <w:t>(Студент №1)</w:t>
       </w:r>
       <w:r>
         <w:rPr>
@@ -1571,6 +1553,7 @@
         <w:rPr>
           <w:rFonts w:ascii="Times New Roman" w:eastAsia="Times New Roman" w:hAnsi="Times New Roman" w:cs="Times New Roman"/>
           <w:bCs/>
+          <w:noProof/>
           <w:sz w:val="28"/>
         </w:rPr>
         <w:drawing>
@@ -1696,6 +1679,7 @@
         <w:rPr>
           <w:rFonts w:ascii="Times New Roman" w:eastAsia="Times New Roman" w:hAnsi="Times New Roman" w:cs="Times New Roman"/>
           <w:bCs/>
+          <w:noProof/>
           <w:sz w:val="28"/>
         </w:rPr>
         <w:drawing>
@@ -1767,6 +1751,7 @@
         <w:rPr>
           <w:rFonts w:ascii="Times New Roman" w:eastAsia="Times New Roman" w:hAnsi="Times New Roman" w:cs="Times New Roman"/>
           <w:bCs/>
+          <w:noProof/>
           <w:sz w:val="28"/>
         </w:rPr>
         <w:drawing>
@@ -1839,6 +1824,7 @@
         <w:rPr>
           <w:rFonts w:ascii="Times New Roman" w:eastAsia="Times New Roman" w:hAnsi="Times New Roman" w:cs="Times New Roman"/>
           <w:bCs/>
+          <w:noProof/>
           <w:sz w:val="28"/>
           <w:lang w:val="en-US"/>
         </w:rPr>
@@ -1893,6 +1879,7 @@
         <w:rPr>
           <w:rFonts w:ascii="Times New Roman" w:eastAsia="Times New Roman" w:hAnsi="Times New Roman" w:cs="Times New Roman"/>
           <w:bCs/>
+          <w:noProof/>
           <w:sz w:val="28"/>
           <w:lang w:val="en-US"/>
         </w:rPr>
@@ -1940,48 +1927,15 @@
           <w:rFonts w:ascii="Times New Roman" w:eastAsia="Times New Roman" w:hAnsi="Times New Roman" w:cs="Times New Roman"/>
           <w:bCs/>
           <w:sz w:val="28"/>
-          <w:lang w:val="en-US"/>
-        </w:rPr>
-      </w:pPr>
-      <w:proofErr w:type="spellStart"/>
-      <w:r>
-        <w:rPr>
-          <w:rFonts w:ascii="Times New Roman" w:eastAsia="Times New Roman" w:hAnsi="Times New Roman" w:cs="Times New Roman"/>
-          <w:bCs/>
-          <w:sz w:val="28"/>
-          <w:lang w:val="en-US"/>
-        </w:rPr>
-        <w:t>Этап</w:t>
-      </w:r>
-      <w:proofErr w:type="spellEnd"/>
-      <w:r>
-        <w:rPr>
-          <w:rFonts w:ascii="Times New Roman" w:eastAsia="Times New Roman" w:hAnsi="Times New Roman" w:cs="Times New Roman"/>
-          <w:bCs/>
-          <w:sz w:val="28"/>
-          <w:lang w:val="en-US"/>
-        </w:rPr>
-        <w:t xml:space="preserve"> 2 (</w:t>
-      </w:r>
-      <w:proofErr w:type="spellStart"/>
-      <w:r>
-        <w:rPr>
-          <w:rFonts w:ascii="Times New Roman" w:eastAsia="Times New Roman" w:hAnsi="Times New Roman" w:cs="Times New Roman"/>
-          <w:bCs/>
-          <w:sz w:val="28"/>
-          <w:lang w:val="en-US"/>
-        </w:rPr>
-        <w:t>основной</w:t>
-      </w:r>
-      <w:proofErr w:type="spellEnd"/>
-      <w:r>
-        <w:rPr>
-          <w:rFonts w:ascii="Times New Roman" w:eastAsia="Times New Roman" w:hAnsi="Times New Roman" w:cs="Times New Roman"/>
-          <w:bCs/>
-          <w:sz w:val="28"/>
-          <w:lang w:val="en-US"/>
-        </w:rPr>
-        <w:t>).</w:t>
+        </w:rPr>
+      </w:pPr>
+      <w:r>
+        <w:rPr>
+          <w:rFonts w:ascii="Times New Roman" w:eastAsia="Times New Roman" w:hAnsi="Times New Roman" w:cs="Times New Roman"/>
+          <w:bCs/>
+          <w:sz w:val="28"/>
+        </w:rPr>
+        <w:t>Этап 2 (основной).</w:t>
       </w:r>
     </w:p>
     <w:p>
@@ -2034,6 +1988,7 @@
         <w:rPr>
           <w:rFonts w:ascii="Times New Roman" w:eastAsia="Times New Roman" w:hAnsi="Times New Roman" w:cs="Times New Roman"/>
           <w:bCs/>
+          <w:noProof/>
           <w:sz w:val="28"/>
         </w:rPr>
         <w:drawing>
@@ -2121,6 +2076,7 @@
         <w:rPr>
           <w:rFonts w:ascii="Times New Roman" w:eastAsia="Times New Roman" w:hAnsi="Times New Roman" w:cs="Times New Roman"/>
           <w:bCs/>
+          <w:noProof/>
           <w:sz w:val="28"/>
         </w:rPr>
         <w:drawing>
@@ -2242,6 +2198,7 @@
         <w:rPr>
           <w:rFonts w:ascii="Times New Roman" w:eastAsia="Times New Roman" w:hAnsi="Times New Roman" w:cs="Times New Roman"/>
           <w:bCs/>
+          <w:noProof/>
           <w:sz w:val="28"/>
         </w:rPr>
         <w:drawing>
@@ -2313,6 +2270,7 @@
         <w:rPr>
           <w:rFonts w:ascii="Times New Roman" w:eastAsia="Times New Roman" w:hAnsi="Times New Roman" w:cs="Times New Roman"/>
           <w:bCs/>
+          <w:noProof/>
           <w:sz w:val="28"/>
         </w:rPr>
         <w:drawing>
@@ -2435,6 +2393,7 @@
         <w:rPr>
           <w:rFonts w:ascii="Times New Roman" w:eastAsia="Times New Roman" w:hAnsi="Times New Roman" w:cs="Times New Roman"/>
           <w:bCs/>
+          <w:noProof/>
           <w:sz w:val="28"/>
           <w:lang w:val="en-US"/>
         </w:rPr>
@@ -2490,6 +2449,7 @@
         <w:rPr>
           <w:rFonts w:ascii="Times New Roman" w:eastAsia="Times New Roman" w:hAnsi="Times New Roman" w:cs="Times New Roman"/>
           <w:bCs/>
+          <w:noProof/>
           <w:sz w:val="28"/>
           <w:lang w:val="en-US"/>
         </w:rPr>
@@ -2605,6 +2565,7 @@
         <w:rPr>
           <w:rFonts w:ascii="Times New Roman" w:eastAsia="Times New Roman" w:hAnsi="Times New Roman" w:cs="Times New Roman"/>
           <w:bCs/>
+          <w:noProof/>
           <w:sz w:val="28"/>
           <w:lang w:val="en-US"/>
         </w:rPr>
@@ -2661,6 +2622,7 @@
         <w:rPr>
           <w:rFonts w:ascii="Times New Roman" w:eastAsia="Times New Roman" w:hAnsi="Times New Roman" w:cs="Times New Roman"/>
           <w:bCs/>
+          <w:noProof/>
           <w:sz w:val="28"/>
           <w:lang w:val="en-US"/>
         </w:rPr>
@@ -2708,18 +2670,60 @@
           <w:rFonts w:ascii="Times New Roman" w:eastAsia="Times New Roman" w:hAnsi="Times New Roman" w:cs="Times New Roman"/>
           <w:bCs/>
           <w:sz w:val="28"/>
-          <w:lang w:val="en-US"/>
-        </w:rPr>
-      </w:pPr>
+        </w:rPr>
+      </w:pPr>
+      <w:r>
+        <w:rPr>
+          <w:rFonts w:ascii="Times New Roman" w:eastAsia="Times New Roman" w:hAnsi="Times New Roman" w:cs="Times New Roman"/>
+          <w:bCs/>
+          <w:sz w:val="28"/>
+        </w:rPr>
+        <w:t>Для студента №2</w:t>
+      </w:r>
+    </w:p>
+    <w:p>
+      <w:pPr>
+        <w:spacing w:after="150" w:line="265" w:lineRule="auto"/>
+        <w:rPr>
+          <w:rFonts w:ascii="Times New Roman" w:eastAsia="Times New Roman" w:hAnsi="Times New Roman" w:cs="Times New Roman"/>
+          <w:bCs/>
+          <w:sz w:val="28"/>
+        </w:rPr>
+      </w:pPr>
+      <w:r>
+        <w:rPr>
+          <w:rFonts w:ascii="Times New Roman" w:eastAsia="Times New Roman" w:hAnsi="Times New Roman" w:cs="Times New Roman"/>
+          <w:bCs/>
+          <w:sz w:val="28"/>
+        </w:rPr>
+        <w:t>Подтвердил свое участие в проекте</w:t>
+      </w:r>
+    </w:p>
+    <w:p>
+      <w:pPr>
+        <w:spacing w:after="150" w:line="265" w:lineRule="auto"/>
+        <w:rPr>
+          <w:rFonts w:ascii="Times New Roman" w:eastAsia="Times New Roman" w:hAnsi="Times New Roman" w:cs="Times New Roman"/>
+          <w:bCs/>
+          <w:sz w:val="28"/>
+        </w:rPr>
+      </w:pPr>
+      <w:r>
+        <w:rPr>
+          <w:rFonts w:ascii="Times New Roman" w:eastAsia="Times New Roman" w:hAnsi="Times New Roman" w:cs="Times New Roman"/>
+          <w:bCs/>
+          <w:sz w:val="28"/>
+        </w:rPr>
+        <w:t xml:space="preserve">Создал локальный репозиторий </w:t>
+      </w:r>
       <w:proofErr w:type="spellStart"/>
       <w:r>
         <w:rPr>
           <w:rFonts w:ascii="Times New Roman" w:eastAsia="Times New Roman" w:hAnsi="Times New Roman" w:cs="Times New Roman"/>
           <w:bCs/>
           <w:sz w:val="28"/>
-          <w:lang w:val="en-US"/>
-        </w:rPr>
-        <w:t>Для</w:t>
+        </w:rPr>
+        <w:t>склонировав</w:t>
       </w:r>
       <w:proofErr w:type="spellEnd"/>
       <w:r>
@@ -2727,81 +2731,6 @@
           <w:rFonts w:ascii="Times New Roman" w:eastAsia="Times New Roman" w:hAnsi="Times New Roman" w:cs="Times New Roman"/>
           <w:bCs/>
           <w:sz w:val="28"/>
-          <w:lang w:val="en-US"/>
-        </w:rPr>
-        <w:t xml:space="preserve"> </w:t>
-      </w:r>
-      <w:proofErr w:type="spellStart"/>
-      <w:r>
-        <w:rPr>
-          <w:rFonts w:ascii="Times New Roman" w:eastAsia="Times New Roman" w:hAnsi="Times New Roman" w:cs="Times New Roman"/>
-          <w:bCs/>
-          <w:sz w:val="28"/>
-          <w:lang w:val="en-US"/>
-        </w:rPr>
-        <w:t>студента</w:t>
-      </w:r>
-      <w:proofErr w:type="spellEnd"/>
-      <w:r>
-        <w:rPr>
-          <w:rFonts w:ascii="Times New Roman" w:eastAsia="Times New Roman" w:hAnsi="Times New Roman" w:cs="Times New Roman"/>
-          <w:bCs/>
-          <w:sz w:val="28"/>
-          <w:lang w:val="en-US"/>
-        </w:rPr>
-        <w:t xml:space="preserve"> №2</w:t>
-      </w:r>
-    </w:p>
-    <w:p>
-      <w:pPr>
-        <w:spacing w:after="150" w:line="265" w:lineRule="auto"/>
-        <w:rPr>
-          <w:rFonts w:ascii="Times New Roman" w:eastAsia="Times New Roman" w:hAnsi="Times New Roman" w:cs="Times New Roman"/>
-          <w:bCs/>
-          <w:sz w:val="28"/>
-        </w:rPr>
-      </w:pPr>
-      <w:r>
-        <w:rPr>
-          <w:rFonts w:ascii="Times New Roman" w:eastAsia="Times New Roman" w:hAnsi="Times New Roman" w:cs="Times New Roman"/>
-          <w:bCs/>
-          <w:sz w:val="28"/>
-        </w:rPr>
-        <w:t>Подтвердил свое участие в проекте</w:t>
-      </w:r>
-    </w:p>
-    <w:p>
-      <w:pPr>
-        <w:spacing w:after="150" w:line="265" w:lineRule="auto"/>
-        <w:rPr>
-          <w:rFonts w:ascii="Times New Roman" w:eastAsia="Times New Roman" w:hAnsi="Times New Roman" w:cs="Times New Roman"/>
-          <w:bCs/>
-          <w:sz w:val="28"/>
-        </w:rPr>
-      </w:pPr>
-      <w:r>
-        <w:rPr>
-          <w:rFonts w:ascii="Times New Roman" w:eastAsia="Times New Roman" w:hAnsi="Times New Roman" w:cs="Times New Roman"/>
-          <w:bCs/>
-          <w:sz w:val="28"/>
-        </w:rPr>
-        <w:t xml:space="preserve">Создал локальный репозиторий </w:t>
-      </w:r>
-      <w:proofErr w:type="spellStart"/>
-      <w:r>
-        <w:rPr>
-          <w:rFonts w:ascii="Times New Roman" w:eastAsia="Times New Roman" w:hAnsi="Times New Roman" w:cs="Times New Roman"/>
-          <w:bCs/>
-          <w:sz w:val="28"/>
-        </w:rPr>
-        <w:t>склонировав</w:t>
-      </w:r>
-      <w:proofErr w:type="spellEnd"/>
-      <w:r>
-        <w:rPr>
-          <w:rFonts w:ascii="Times New Roman" w:eastAsia="Times New Roman" w:hAnsi="Times New Roman" w:cs="Times New Roman"/>
-          <w:bCs/>
-          <w:sz w:val="28"/>
         </w:rPr>
         <w:t xml:space="preserve"> себе общий репозиторий</w:t>
       </w:r>
@@ -2820,6 +2749,7 @@
         <w:rPr>
           <w:rFonts w:ascii="Times New Roman" w:eastAsia="Times New Roman" w:hAnsi="Times New Roman" w:cs="Times New Roman"/>
           <w:bCs/>
+          <w:noProof/>
           <w:sz w:val="28"/>
         </w:rPr>
         <w:drawing>
@@ -2892,6 +2822,7 @@
         <w:rPr>
           <w:rFonts w:ascii="Times New Roman" w:eastAsia="Times New Roman" w:hAnsi="Times New Roman" w:cs="Times New Roman"/>
           <w:bCs/>
+          <w:noProof/>
           <w:sz w:val="28"/>
           <w:lang w:val="en-US"/>
         </w:rPr>
@@ -2982,6 +2913,7 @@
         <w:rPr>
           <w:rFonts w:ascii="Times New Roman" w:eastAsia="Times New Roman" w:hAnsi="Times New Roman" w:cs="Times New Roman"/>
           <w:bCs/>
+          <w:noProof/>
           <w:sz w:val="28"/>
         </w:rPr>
         <w:lastRenderedPageBreak/>
@@ -3130,6 +3062,7 @@
         <w:rPr>
           <w:rFonts w:ascii="Times New Roman" w:eastAsia="Times New Roman" w:hAnsi="Times New Roman" w:cs="Times New Roman"/>
           <w:bCs/>
+          <w:noProof/>
           <w:sz w:val="28"/>
         </w:rPr>
         <w:drawing>
@@ -3202,6 +3135,7 @@
         <w:rPr>
           <w:rFonts w:ascii="Times New Roman" w:eastAsia="Times New Roman" w:hAnsi="Times New Roman" w:cs="Times New Roman"/>
           <w:bCs/>
+          <w:noProof/>
           <w:sz w:val="28"/>
           <w:lang w:val="en-US"/>
         </w:rPr>
@@ -3318,6 +3252,7 @@
         <w:rPr>
           <w:rFonts w:ascii="Times New Roman" w:eastAsia="Times New Roman" w:hAnsi="Times New Roman" w:cs="Times New Roman"/>
           <w:bCs/>
+          <w:noProof/>
           <w:sz w:val="28"/>
           <w:lang w:val="en-US"/>
         </w:rPr>
@@ -3401,6 +3336,7 @@
         <w:rPr>
           <w:rFonts w:ascii="Times New Roman" w:eastAsia="Times New Roman" w:hAnsi="Times New Roman" w:cs="Times New Roman"/>
           <w:bCs/>
+          <w:noProof/>
           <w:sz w:val="28"/>
           <w:lang w:val="en-US"/>
         </w:rPr>
@@ -3456,6 +3392,7 @@
         <w:rPr>
           <w:rFonts w:ascii="Times New Roman" w:eastAsia="Times New Roman" w:hAnsi="Times New Roman" w:cs="Times New Roman"/>
           <w:bCs/>
+          <w:noProof/>
           <w:sz w:val="28"/>
           <w:lang w:val="en-US"/>
         </w:rPr>
@@ -3511,26 +3448,8 @@
           <w:bCs/>
           <w:sz w:val="28"/>
         </w:rPr>
-        <w:t>Этап 3 (заключительный</w:t>
-      </w:r>
-      <w:proofErr w:type="gramStart"/>
-      <w:r>
-        <w:rPr>
-          <w:rFonts w:ascii="Times New Roman" w:eastAsia="Times New Roman" w:hAnsi="Times New Roman" w:cs="Times New Roman"/>
-          <w:bCs/>
-          <w:sz w:val="28"/>
-        </w:rPr>
-        <w:t>)</w:t>
-      </w:r>
-      <w:r>
-        <w:rPr>
-          <w:rFonts w:ascii="Times New Roman" w:eastAsia="Times New Roman" w:hAnsi="Times New Roman" w:cs="Times New Roman"/>
-          <w:bCs/>
-          <w:sz w:val="28"/>
-        </w:rPr>
-        <w:t>(</w:t>
-      </w:r>
-      <w:proofErr w:type="gramEnd"/>
+        <w:t>Этап 3 (заключительный)(</w:t>
+      </w:r>
       <w:r>
         <w:rPr>
           <w:rFonts w:ascii="Times New Roman" w:eastAsia="Times New Roman" w:hAnsi="Times New Roman" w:cs="Times New Roman"/>
@@ -3555,15 +3474,7 @@
           <w:bCs/>
           <w:sz w:val="28"/>
         </w:rPr>
-        <w:t>П</w:t>
-      </w:r>
-      <w:r>
-        <w:rPr>
-          <w:rFonts w:ascii="Times New Roman" w:eastAsia="Times New Roman" w:hAnsi="Times New Roman" w:cs="Times New Roman"/>
-          <w:bCs/>
-          <w:sz w:val="28"/>
-        </w:rPr>
-        <w:t>олучи</w:t>
+        <w:t>Получи</w:t>
       </w:r>
       <w:r>
         <w:rPr>
@@ -3596,6 +3507,7 @@
         <w:rPr>
           <w:rFonts w:ascii="Times New Roman" w:eastAsia="Times New Roman" w:hAnsi="Times New Roman" w:cs="Times New Roman"/>
           <w:bCs/>
+          <w:noProof/>
           <w:sz w:val="28"/>
         </w:rPr>
         <w:drawing>
@@ -3656,6 +3568,109 @@
     <w:p>
       <w:pPr>
         <w:spacing w:after="150" w:line="265" w:lineRule="auto"/>
+        <w:jc w:val="center"/>
+        <w:rPr>
+          <w:rFonts w:ascii="Times New Roman" w:eastAsia="Times New Roman" w:hAnsi="Times New Roman" w:cs="Times New Roman"/>
+          <w:bCs/>
+          <w:sz w:val="28"/>
+        </w:rPr>
+      </w:pPr>
+      <w:r>
+        <w:rPr>
+          <w:rFonts w:ascii="Times New Roman" w:eastAsia="Times New Roman" w:hAnsi="Times New Roman" w:cs="Times New Roman"/>
+          <w:bCs/>
+          <w:sz w:val="28"/>
+        </w:rPr>
+        <w:drawing>
+          <wp:inline distT="0" distB="0" distL="0" distR="0" wp14:anchorId="6EE76A19" wp14:editId="3EDE45B5">
+            <wp:extent cx="4372585" cy="1019317"/>
+            <wp:effectExtent l="0" t="0" r="9525" b="9525"/>
+            <wp:docPr id="15" name="Рисунок 15"/>
+            <wp:cNvGraphicFramePr>
+              <a:graphicFrameLocks xmlns:a="http://schemas.openxmlformats.org/drawingml/2006/main" noChangeAspect="1"/>
+            </wp:cNvGraphicFramePr>
+            <a:graphic xmlns:a="http://schemas.openxmlformats.org/drawingml/2006/main">
+              <a:graphicData uri="http://schemas.openxmlformats.org/drawingml/2006/picture">
+                <pic:pic xmlns:pic="http://schemas.openxmlformats.org/drawingml/2006/picture">
+                  <pic:nvPicPr>
+                    <pic:cNvPr id="1" name=""/>
+                    <pic:cNvPicPr/>
+                  </pic:nvPicPr>
+                  <pic:blipFill>
+                    <a:blip r:embed="rId33"/>
+                    <a:stretch>
+                      <a:fillRect/>
+                    </a:stretch>
+                  </pic:blipFill>
+                  <pic:spPr>
+                    <a:xfrm>
+                      <a:off x="0" y="0"/>
+                      <a:ext cx="4372585" cy="1019317"/>
+                    </a:xfrm>
+                    <a:prstGeom prst="rect">
+                      <a:avLst/>
+                    </a:prstGeom>
+                  </pic:spPr>
+                </pic:pic>
+              </a:graphicData>
+            </a:graphic>
+          </wp:inline>
+        </w:drawing>
+      </w:r>
+    </w:p>
+    <w:p>
+      <w:pPr>
+        <w:spacing w:after="150" w:line="265" w:lineRule="auto"/>
+        <w:rPr>
+          <w:rFonts w:ascii="Times New Roman" w:eastAsia="Times New Roman" w:hAnsi="Times New Roman" w:cs="Times New Roman"/>
+          <w:bCs/>
+          <w:sz w:val="28"/>
+        </w:rPr>
+      </w:pPr>
+      <w:r>
+        <w:rPr>
+          <w:rFonts w:ascii="Times New Roman" w:eastAsia="Times New Roman" w:hAnsi="Times New Roman" w:cs="Times New Roman"/>
+          <w:bCs/>
+          <w:sz w:val="28"/>
+        </w:rPr>
+        <w:t>Добавил ссылку на совместный репозиторий в конец отчета:</w:t>
+      </w:r>
+    </w:p>
+    <w:p>
+      <w:pPr>
+        <w:spacing w:after="150" w:line="265" w:lineRule="auto"/>
+        <w:rPr>
+          <w:rFonts w:ascii="Times New Roman" w:eastAsia="Times New Roman" w:hAnsi="Times New Roman" w:cs="Times New Roman"/>
+          <w:bCs/>
+          <w:sz w:val="28"/>
+          <w:lang w:val="en-US"/>
+        </w:rPr>
+      </w:pPr>
+      <w:hyperlink r:id="rId34" w:history="1">
+        <w:r>
+          <w:rPr>
+            <w:rStyle w:val="a4"/>
+            <w:rFonts w:ascii="Times New Roman" w:eastAsia="Times New Roman" w:hAnsi="Times New Roman" w:cs="Times New Roman"/>
+            <w:bCs/>
+            <w:sz w:val="28"/>
+          </w:rPr>
+          <w:t>https://github.com/kaitoo77/FInalWor</w:t>
+        </w:r>
+        <w:r>
+          <w:rPr>
+            <w:rStyle w:val="a4"/>
+            <w:rFonts w:ascii="Times New Roman" w:eastAsia="Times New Roman" w:hAnsi="Times New Roman" w:cs="Times New Roman"/>
+            <w:bCs/>
+            <w:sz w:val="28"/>
+            <w:lang w:val="en-US"/>
+          </w:rPr>
+          <w:t>k</w:t>
+        </w:r>
+      </w:hyperlink>
+    </w:p>
+    <w:p>
+      <w:pPr>
+        <w:spacing w:after="150" w:line="265" w:lineRule="auto"/>
         <w:rPr>
           <w:rFonts w:ascii="Times New Roman" w:eastAsia="Times New Roman" w:hAnsi="Times New Roman" w:cs="Times New Roman"/>
           <w:bCs/>
@@ -3678,6 +3693,7 @@
           <w:bCs/>
           <w:sz w:val="28"/>
         </w:rPr>
+        <w:lastRenderedPageBreak/>
         <w:t xml:space="preserve">Вывод: </w:t>
       </w:r>
       <w:r>

</xml_diff>